<commit_message>
feat: add course and enrollment data models with strict relationships
</commit_message>
<xml_diff>
--- a/guid.docx
+++ b/guid.docx
@@ -131,18 +131,13 @@
       </w:r>
       <w:proofErr w:type="spellEnd"/>
       <w:r>
-        <w:t xml:space="preserve">/" </w:t>
-      </w:r>
-      <w:proofErr w:type="gramStart"/>
-      <w:r>
-        <w:t>&gt; .</w:t>
+        <w:t>/" &gt; .</w:t>
       </w:r>
       <w:proofErr w:type="spellStart"/>
       <w:r>
         <w:t>gitignore</w:t>
       </w:r>
       <w:proofErr w:type="spellEnd"/>
-      <w:proofErr w:type="gramEnd"/>
     </w:p>
     <w:p>
       <w:r>
@@ -154,41 +149,23 @@
       </w:r>
       <w:proofErr w:type="spellEnd"/>
       <w:r>
-        <w:t>" &gt;</w:t>
-      </w:r>
-      <w:proofErr w:type="gramStart"/>
-      <w:r>
-        <w:t>&gt; .</w:t>
+        <w:t>" &gt;&gt; .</w:t>
       </w:r>
       <w:proofErr w:type="spellStart"/>
       <w:r>
         <w:t>gitignore</w:t>
       </w:r>
       <w:proofErr w:type="spellEnd"/>
-      <w:proofErr w:type="gramEnd"/>
-    </w:p>
-    <w:p>
-      <w:r>
-        <w:t xml:space="preserve">echo </w:t>
-      </w:r>
-      <w:proofErr w:type="gramStart"/>
-      <w:r>
-        <w:t>".env</w:t>
-      </w:r>
-      <w:proofErr w:type="gramEnd"/>
-      <w:r>
-        <w:t>" &gt;</w:t>
-      </w:r>
-      <w:proofErr w:type="gramStart"/>
-      <w:r>
-        <w:t>&gt; .</w:t>
+    </w:p>
+    <w:p>
+      <w:r>
+        <w:t>echo ".env" &gt;&gt; .</w:t>
       </w:r>
       <w:proofErr w:type="spellStart"/>
       <w:r>
         <w:t>gitignore</w:t>
       </w:r>
       <w:proofErr w:type="spellEnd"/>
-      <w:proofErr w:type="gramEnd"/>
     </w:p>
     <w:p>
       <w:r>
@@ -200,33 +177,23 @@
       </w:r>
       <w:proofErr w:type="spellEnd"/>
       <w:r>
-        <w:t>__/" &gt;</w:t>
-      </w:r>
-      <w:proofErr w:type="gramStart"/>
-      <w:r>
-        <w:t>&gt; .</w:t>
+        <w:t>__/" &gt;&gt; .</w:t>
       </w:r>
       <w:proofErr w:type="spellStart"/>
       <w:r>
         <w:t>gitignore</w:t>
       </w:r>
       <w:proofErr w:type="spellEnd"/>
-      <w:proofErr w:type="gramEnd"/>
-    </w:p>
-    <w:p>
-      <w:r>
-        <w:t>echo "db.sqlite3" &gt;</w:t>
-      </w:r>
-      <w:proofErr w:type="gramStart"/>
-      <w:r>
-        <w:t>&gt; .</w:t>
+    </w:p>
+    <w:p>
+      <w:r>
+        <w:t>echo "db.sqlite3" &gt;&gt; .</w:t>
       </w:r>
       <w:proofErr w:type="spellStart"/>
       <w:r>
         <w:t>gitignore</w:t>
       </w:r>
       <w:proofErr w:type="spellEnd"/>
-      <w:proofErr w:type="gramEnd"/>
       <w:r>
         <w:t xml:space="preserve">  # Just in case you fallback to SQLite temporarily</w:t>
       </w:r>
@@ -265,15 +232,7 @@
       </w:r>
       <w:proofErr w:type="spellEnd"/>
       <w:r>
-        <w:t>/bin/</w:t>
-      </w:r>
-      <w:proofErr w:type="gramStart"/>
-      <w:r>
-        <w:t>activate  #</w:t>
-      </w:r>
-      <w:proofErr w:type="gramEnd"/>
-      <w:r>
-        <w:t xml:space="preserve"> Windows: </w:t>
+        <w:t xml:space="preserve">/bin/activate  # Windows: </w:t>
       </w:r>
       <w:proofErr w:type="spellStart"/>
       <w:r>
@@ -347,26 +306,13 @@
         <w:t>Why this matters:</w:t>
       </w:r>
       <w:r>
-        <w:t xml:space="preserve"> When your team clones this repo, they will simply run pip install -r requirements.txt. </w:t>
-      </w:r>
-      <w:proofErr w:type="gramStart"/>
-      <w:r>
-        <w:t>Because .env</w:t>
-      </w:r>
-      <w:proofErr w:type="gramEnd"/>
-      <w:r>
-        <w:t xml:space="preserve"> is in </w:t>
-      </w:r>
-      <w:proofErr w:type="gramStart"/>
-      <w:r>
-        <w:t>the .</w:t>
+        <w:t xml:space="preserve"> When your team clones this repo, they will simply run pip install -r requirements.txt. Because .env is in the .</w:t>
       </w:r>
       <w:proofErr w:type="spellStart"/>
       <w:r>
         <w:t>gitignore</w:t>
       </w:r>
       <w:proofErr w:type="spellEnd"/>
-      <w:proofErr w:type="gramEnd"/>
       <w:r>
         <w:t>, you guarantee that no one accidentally commits database passwords to version control—a critical security standard, especially when handling complex or predictive data platforms.</w:t>
       </w:r>
@@ -374,7 +320,7 @@
     <w:p>
       <w:r>
         <w:pict w14:anchorId="75C3F2B4">
-          <v:rect id="_x0000_i1037" style="width:0;height:1.5pt" o:hralign="center" o:hrstd="t" o:hr="t" fillcolor="#a0a0a0" stroked="f"/>
+          <v:rect id="_x0000_i1025" style="width:0;height:1.5pt" o:hralign="center" o:hrstd="t" o:hr="t" fillcolor="#a0a0a0" stroked="f"/>
         </w:pict>
       </w:r>
     </w:p>
@@ -440,13 +386,8 @@
       </w:r>
       <w:proofErr w:type="spellEnd"/>
       <w:r>
-        <w:t xml:space="preserve"> </w:t>
-      </w:r>
-      <w:proofErr w:type="gramStart"/>
-      <w:r>
-        <w:t>config .</w:t>
-      </w:r>
-      <w:proofErr w:type="gramEnd"/>
+        <w:t xml:space="preserve"> config .</w:t>
+      </w:r>
     </w:p>
     <w:p>
       <w:r>
@@ -589,76 +530,36 @@
     </w:p>
     <w:p>
       <w:r>
-        <w:t>BASE_DIR = Path(__file__</w:t>
-      </w:r>
-      <w:proofErr w:type="gramStart"/>
-      <w:r>
-        <w:t>).resolve</w:t>
-      </w:r>
-      <w:proofErr w:type="gramEnd"/>
+        <w:t>BASE_DIR = Path(__file__).resolve().</w:t>
+      </w:r>
+      <w:proofErr w:type="spellStart"/>
+      <w:r>
+        <w:t>parent.parent</w:t>
+      </w:r>
+      <w:proofErr w:type="spellEnd"/>
+    </w:p>
+    <w:p/>
+    <w:p>
+      <w:r>
+        <w:t># Load environment variables from .env file</w:t>
+      </w:r>
+    </w:p>
+    <w:p>
+      <w:proofErr w:type="spellStart"/>
+      <w:r>
+        <w:t>load_dotenv</w:t>
+      </w:r>
+      <w:proofErr w:type="spellEnd"/>
       <w:r>
         <w:t>(</w:t>
       </w:r>
-      <w:proofErr w:type="gramStart"/>
-      <w:r>
-        <w:t>).</w:t>
-      </w:r>
-      <w:proofErr w:type="spellStart"/>
-      <w:r>
-        <w:t>parent</w:t>
-      </w:r>
-      <w:proofErr w:type="gramEnd"/>
-      <w:r>
-        <w:t>.parent</w:t>
-      </w:r>
-      <w:proofErr w:type="spellEnd"/>
-    </w:p>
-    <w:p/>
-    <w:p>
-      <w:r>
-        <w:t># Load environment variables from .env file</w:t>
-      </w:r>
-    </w:p>
-    <w:p>
-      <w:proofErr w:type="spellStart"/>
-      <w:r>
-        <w:t>load_</w:t>
-      </w:r>
-      <w:proofErr w:type="gramStart"/>
-      <w:r>
-        <w:t>dotenv</w:t>
-      </w:r>
-      <w:proofErr w:type="spellEnd"/>
-      <w:r>
-        <w:t>(</w:t>
-      </w:r>
-      <w:proofErr w:type="spellStart"/>
-      <w:r>
-        <w:t>os.path</w:t>
-      </w:r>
-      <w:proofErr w:type="gramEnd"/>
-      <w:r>
-        <w:t>.</w:t>
-      </w:r>
-      <w:proofErr w:type="gramStart"/>
-      <w:r>
-        <w:t>join</w:t>
-      </w:r>
-      <w:proofErr w:type="spellEnd"/>
-      <w:r>
-        <w:t>(</w:t>
-      </w:r>
-      <w:proofErr w:type="gramEnd"/>
-      <w:r>
-        <w:t xml:space="preserve">BASE_DIR, </w:t>
-      </w:r>
-      <w:proofErr w:type="gramStart"/>
-      <w:r>
-        <w:t>'.env</w:t>
-      </w:r>
-      <w:proofErr w:type="gramEnd"/>
-      <w:r>
-        <w:t>'))</w:t>
+      <w:proofErr w:type="spellStart"/>
+      <w:r>
+        <w:t>os.path.join</w:t>
+      </w:r>
+      <w:proofErr w:type="spellEnd"/>
+      <w:r>
+        <w:t>(BASE_DIR, '.env'))</w:t>
       </w:r>
     </w:p>
     <w:p/>
@@ -723,15 +624,7 @@
       </w:r>
       <w:proofErr w:type="spellStart"/>
       <w:r>
-        <w:t>django.</w:t>
-      </w:r>
-      <w:proofErr w:type="gramStart"/>
-      <w:r>
-        <w:t>db.backends</w:t>
-      </w:r>
-      <w:proofErr w:type="gramEnd"/>
-      <w:r>
-        <w:t>.mysql</w:t>
+        <w:t>django.db.backends.mysql</w:t>
       </w:r>
       <w:proofErr w:type="spellEnd"/>
       <w:r>
@@ -813,13 +706,8 @@
         <w:t xml:space="preserve">            '</w:t>
       </w:r>
       <w:proofErr w:type="spellStart"/>
-      <w:proofErr w:type="gramStart"/>
-      <w:r>
-        <w:t>init</w:t>
-      </w:r>
-      <w:proofErr w:type="gramEnd"/>
-      <w:r>
-        <w:t>_command</w:t>
+      <w:r>
+        <w:t>init_command</w:t>
       </w:r>
       <w:proofErr w:type="spellEnd"/>
       <w:r>
@@ -870,7 +758,7 @@
     <w:p>
       <w:r>
         <w:pict w14:anchorId="7942CD69">
-          <v:rect id="_x0000_i1038" style="width:0;height:1.5pt" o:hralign="center" o:hrstd="t" o:hr="t" fillcolor="#a0a0a0" stroked="f"/>
+          <v:rect id="_x0000_i1026" style="width:0;height:1.5pt" o:hralign="center" o:hrstd="t" o:hr="t" fillcolor="#a0a0a0" stroked="f"/>
         </w:pict>
       </w:r>
     </w:p>
@@ -910,13 +798,8 @@
     </w:p>
     <w:p>
       <w:r>
-        <w:t xml:space="preserve">git </w:t>
-      </w:r>
-      <w:proofErr w:type="gramStart"/>
-      <w:r>
-        <w:t>add .</w:t>
-      </w:r>
-      <w:proofErr w:type="gramEnd"/>
+        <w:t>git add .</w:t>
+      </w:r>
     </w:p>
     <w:p>
       <w:r>
@@ -976,6 +859,1174 @@
       </w:r>
       <w:r>
         <w:t xml:space="preserve"> You've just created standard Git Flow. main is strictly for production-ready, deployable code. develop is where all the integrated features live. When the rest of the squad starts working, they will branch off develop (e.g., git checkout -b feature/user-auth), write their code, and submit a Pull Request back to develop.</w:t>
+      </w:r>
+    </w:p>
+    <w:p>
+      <w:r>
+        <w:t>Day 2 is where the real architecture begins, and your instinct here is spot-on. Implementing a Custom User model right out of the gate is the single most important rule in Django production. Skipping it and trying to retrofit it later is a massive headache that requires complex database surgery.</w:t>
+      </w:r>
+    </w:p>
+    <w:p>
+      <w:r>
+        <w:t xml:space="preserve">By locking this down now, when Charith, </w:t>
+      </w:r>
+      <w:proofErr w:type="spellStart"/>
+      <w:r>
+        <w:t>Withana</w:t>
+      </w:r>
+      <w:proofErr w:type="spellEnd"/>
+      <w:r>
+        <w:t xml:space="preserve">, Lakmali, and </w:t>
+      </w:r>
+      <w:proofErr w:type="spellStart"/>
+      <w:r>
+        <w:t>Nawarathna</w:t>
+      </w:r>
+      <w:proofErr w:type="spellEnd"/>
+      <w:r>
+        <w:t xml:space="preserve"> pull the repository, they will be building their features on top of a solid, extensible identity system.</w:t>
+      </w:r>
+    </w:p>
+    <w:p>
+      <w:r>
+        <w:t>Here is the exact execution plan for Day 2, leveled up with the necessary boilerplate to ensure your Django Admin doesn't break when managing these new users.</w:t>
+      </w:r>
+    </w:p>
+    <w:p>
+      <w:pPr>
+        <w:rPr>
+          <w:b/>
+          <w:bCs/>
+        </w:rPr>
+      </w:pPr>
+      <w:r>
+        <w:rPr>
+          <w:b/>
+          <w:bCs/>
+        </w:rPr>
+        <w:t>Step 1: Create the Feature Branch</w:t>
+      </w:r>
+    </w:p>
+    <w:p>
+      <w:r>
+        <w:t>Your Git workflow is exactly how Agile teams isolate work. You always branch off the latest integration code.</w:t>
+      </w:r>
+    </w:p>
+    <w:p>
+      <w:r>
+        <w:rPr>
+          <w:b/>
+          <w:bCs/>
+        </w:rPr>
+        <w:t>The Best Practice Execution:</w:t>
+      </w:r>
+    </w:p>
+    <w:p>
+      <w:r>
+        <w:t>Bash</w:t>
+      </w:r>
+    </w:p>
+    <w:p>
+      <w:r>
+        <w:t># Ensure you are on develop and up to date</w:t>
+      </w:r>
+    </w:p>
+    <w:p>
+      <w:r>
+        <w:t>git checkout develop</w:t>
+      </w:r>
+    </w:p>
+    <w:p>
+      <w:r>
+        <w:t>git pull origin develop</w:t>
+      </w:r>
+    </w:p>
+    <w:p/>
+    <w:p>
+      <w:r>
+        <w:t># Create and switch to your feature branch</w:t>
+      </w:r>
+    </w:p>
+    <w:p>
+      <w:r>
+        <w:t>git checkout -b feature/auth-system</w:t>
+      </w:r>
+    </w:p>
+    <w:p>
+      <w:pPr>
+        <w:numPr>
+          <w:ilvl w:val="0"/>
+          <w:numId w:val="4"/>
+        </w:numPr>
+      </w:pPr>
+      <w:r>
+        <w:rPr>
+          <w:b/>
+          <w:bCs/>
+        </w:rPr>
+        <w:t>Why this matters:</w:t>
+      </w:r>
+      <w:r>
+        <w:t xml:space="preserve"> If a hotfix needs to happen on main, or another squad member merges a different feature into develop, your feature/auth-system branch remains isolated and stable until you are ready to merge it back.</w:t>
+      </w:r>
+    </w:p>
+    <w:p>
+      <w:r>
+        <w:lastRenderedPageBreak/>
+        <w:pict w14:anchorId="0B6A26E8">
+          <v:rect id="_x0000_i1027" style="width:0;height:1.5pt" o:hralign="center" o:hrstd="t" o:hr="t" fillcolor="#a0a0a0" stroked="f"/>
+        </w:pict>
+      </w:r>
+    </w:p>
+    <w:p>
+      <w:pPr>
+        <w:rPr>
+          <w:b/>
+          <w:bCs/>
+        </w:rPr>
+      </w:pPr>
+      <w:r>
+        <w:rPr>
+          <w:b/>
+          <w:bCs/>
+        </w:rPr>
+        <w:t>Step 2: Build the users App &amp; Custom Model</w:t>
+      </w:r>
+    </w:p>
+    <w:p>
+      <w:r>
+        <w:t>Let's generate the app and write the model.</w:t>
+      </w:r>
+    </w:p>
+    <w:p>
+      <w:r>
+        <w:rPr>
+          <w:b/>
+          <w:bCs/>
+        </w:rPr>
+        <w:t>The Best Practice Execution:</w:t>
+      </w:r>
+    </w:p>
+    <w:p>
+      <w:r>
+        <w:t>Bash</w:t>
+      </w:r>
+    </w:p>
+    <w:p>
+      <w:r>
+        <w:t xml:space="preserve">python manage.py </w:t>
+      </w:r>
+      <w:proofErr w:type="spellStart"/>
+      <w:r>
+        <w:t>startapp</w:t>
+      </w:r>
+      <w:proofErr w:type="spellEnd"/>
+      <w:r>
+        <w:t xml:space="preserve"> users</w:t>
+      </w:r>
+    </w:p>
+    <w:p>
+      <w:r>
+        <w:t xml:space="preserve">Next, define the model in users/models.py. Inheriting from </w:t>
+      </w:r>
+      <w:proofErr w:type="spellStart"/>
+      <w:r>
+        <w:t>AbstractUser</w:t>
+      </w:r>
+      <w:proofErr w:type="spellEnd"/>
+      <w:r>
+        <w:t xml:space="preserve"> is perfect because it gives you Django's built-in authentication (passwords, hashing, permissions) while letting you add custom fields.</w:t>
+      </w:r>
+    </w:p>
+    <w:p>
+      <w:r>
+        <w:t>Python</w:t>
+      </w:r>
+    </w:p>
+    <w:p>
+      <w:r>
+        <w:t># users/models.py</w:t>
+      </w:r>
+    </w:p>
+    <w:p>
+      <w:r>
+        <w:t xml:space="preserve">from </w:t>
+      </w:r>
+      <w:proofErr w:type="spellStart"/>
+      <w:r>
+        <w:t>django.contrib.auth.models</w:t>
+      </w:r>
+      <w:proofErr w:type="spellEnd"/>
+      <w:r>
+        <w:t xml:space="preserve"> import </w:t>
+      </w:r>
+      <w:proofErr w:type="spellStart"/>
+      <w:r>
+        <w:t>AbstractUser</w:t>
+      </w:r>
+      <w:proofErr w:type="spellEnd"/>
+    </w:p>
+    <w:p>
+      <w:r>
+        <w:t xml:space="preserve">from </w:t>
+      </w:r>
+      <w:proofErr w:type="spellStart"/>
+      <w:r>
+        <w:t>django.db</w:t>
+      </w:r>
+      <w:proofErr w:type="spellEnd"/>
+      <w:r>
+        <w:t xml:space="preserve"> import models</w:t>
+      </w:r>
+    </w:p>
+    <w:p/>
+    <w:p>
+      <w:r>
+        <w:t xml:space="preserve">class </w:t>
+      </w:r>
+      <w:proofErr w:type="spellStart"/>
+      <w:r>
+        <w:t>CustomUser</w:t>
+      </w:r>
+      <w:proofErr w:type="spellEnd"/>
+      <w:r>
+        <w:t>(</w:t>
+      </w:r>
+      <w:proofErr w:type="spellStart"/>
+      <w:r>
+        <w:t>AbstractUser</w:t>
+      </w:r>
+      <w:proofErr w:type="spellEnd"/>
+      <w:r>
+        <w:t>):</w:t>
+      </w:r>
+    </w:p>
+    <w:p>
+      <w:r>
+        <w:t xml:space="preserve">    # Add your custom fields here</w:t>
+      </w:r>
+    </w:p>
+    <w:p>
+      <w:r>
+        <w:t xml:space="preserve">    </w:t>
+      </w:r>
+      <w:proofErr w:type="spellStart"/>
+      <w:r>
+        <w:t>is_student</w:t>
+      </w:r>
+      <w:proofErr w:type="spellEnd"/>
+      <w:r>
+        <w:t xml:space="preserve"> = </w:t>
+      </w:r>
+      <w:proofErr w:type="spellStart"/>
+      <w:r>
+        <w:t>models.BooleanField</w:t>
+      </w:r>
+      <w:proofErr w:type="spellEnd"/>
+      <w:r>
+        <w:t>(default=False)</w:t>
+      </w:r>
+    </w:p>
+    <w:p>
+      <w:r>
+        <w:t xml:space="preserve">    </w:t>
+      </w:r>
+      <w:proofErr w:type="spellStart"/>
+      <w:r>
+        <w:t>is_instructor</w:t>
+      </w:r>
+      <w:proofErr w:type="spellEnd"/>
+      <w:r>
+        <w:t xml:space="preserve"> = </w:t>
+      </w:r>
+      <w:proofErr w:type="spellStart"/>
+      <w:r>
+        <w:t>models.BooleanField</w:t>
+      </w:r>
+      <w:proofErr w:type="spellEnd"/>
+      <w:r>
+        <w:t>(default=False)</w:t>
+      </w:r>
+    </w:p>
+    <w:p>
+      <w:r>
+        <w:t xml:space="preserve">    </w:t>
+      </w:r>
+    </w:p>
+    <w:p>
+      <w:r>
+        <w:t xml:space="preserve">    # Best practice: Add </w:t>
+      </w:r>
+      <w:proofErr w:type="spellStart"/>
+      <w:r>
+        <w:t>related_name</w:t>
+      </w:r>
+      <w:proofErr w:type="spellEnd"/>
+      <w:r>
+        <w:t xml:space="preserve"> to avoid clashes if you ever use </w:t>
+      </w:r>
+      <w:proofErr w:type="spellStart"/>
+      <w:r>
+        <w:t>auth.User</w:t>
+      </w:r>
+      <w:proofErr w:type="spellEnd"/>
+    </w:p>
+    <w:p>
+      <w:r>
+        <w:t xml:space="preserve">    # You can also add things like 'bio' or '</w:t>
+      </w:r>
+      <w:proofErr w:type="spellStart"/>
+      <w:r>
+        <w:t>profile_picture</w:t>
+      </w:r>
+      <w:proofErr w:type="spellEnd"/>
+      <w:r>
+        <w:t>' later.</w:t>
+      </w:r>
+    </w:p>
+    <w:p>
+      <w:r>
+        <w:t xml:space="preserve">    </w:t>
+      </w:r>
+    </w:p>
+    <w:p>
+      <w:r>
+        <w:t xml:space="preserve">    def __str__(self):</w:t>
+      </w:r>
+    </w:p>
+    <w:p>
+      <w:r>
+        <w:t xml:space="preserve">        return </w:t>
+      </w:r>
+      <w:proofErr w:type="spellStart"/>
+      <w:r>
+        <w:t>self.username</w:t>
+      </w:r>
+      <w:proofErr w:type="spellEnd"/>
+    </w:p>
+    <w:p>
+      <w:r>
+        <w:rPr>
+          <w:b/>
+          <w:bCs/>
+        </w:rPr>
+        <w:t>CRITICAL Best Practice (The Missing Step):</w:t>
+      </w:r>
+      <w:r>
+        <w:t xml:space="preserve"> If you create a custom user model, you </w:t>
+      </w:r>
+      <w:r>
+        <w:rPr>
+          <w:b/>
+          <w:bCs/>
+        </w:rPr>
+        <w:t>must</w:t>
+      </w:r>
+      <w:r>
+        <w:t xml:space="preserve"> update users/admin.py. If you don't, the default Django Admin panel will crash when you try to change user passwords.</w:t>
+      </w:r>
+    </w:p>
+    <w:p>
+      <w:r>
+        <w:t>Python</w:t>
+      </w:r>
+    </w:p>
+    <w:p>
+      <w:r>
+        <w:lastRenderedPageBreak/>
+        <w:t># users/admin.py</w:t>
+      </w:r>
+    </w:p>
+    <w:p>
+      <w:r>
+        <w:t xml:space="preserve">from </w:t>
+      </w:r>
+      <w:proofErr w:type="spellStart"/>
+      <w:r>
+        <w:t>django.contrib</w:t>
+      </w:r>
+      <w:proofErr w:type="spellEnd"/>
+      <w:r>
+        <w:t xml:space="preserve"> import admin</w:t>
+      </w:r>
+    </w:p>
+    <w:p>
+      <w:r>
+        <w:t xml:space="preserve">from </w:t>
+      </w:r>
+      <w:proofErr w:type="spellStart"/>
+      <w:r>
+        <w:t>django.contrib.auth.admin</w:t>
+      </w:r>
+      <w:proofErr w:type="spellEnd"/>
+      <w:r>
+        <w:t xml:space="preserve"> import </w:t>
+      </w:r>
+      <w:proofErr w:type="spellStart"/>
+      <w:r>
+        <w:t>UserAdmin</w:t>
+      </w:r>
+      <w:proofErr w:type="spellEnd"/>
+    </w:p>
+    <w:p>
+      <w:r>
+        <w:t xml:space="preserve">from .models import </w:t>
+      </w:r>
+      <w:proofErr w:type="spellStart"/>
+      <w:r>
+        <w:t>CustomUser</w:t>
+      </w:r>
+      <w:proofErr w:type="spellEnd"/>
+    </w:p>
+    <w:p/>
+    <w:p>
+      <w:r>
+        <w:t xml:space="preserve">class </w:t>
+      </w:r>
+      <w:proofErr w:type="spellStart"/>
+      <w:r>
+        <w:t>CustomUserAdmin</w:t>
+      </w:r>
+      <w:proofErr w:type="spellEnd"/>
+      <w:r>
+        <w:t>(</w:t>
+      </w:r>
+      <w:proofErr w:type="spellStart"/>
+      <w:r>
+        <w:t>UserAdmin</w:t>
+      </w:r>
+      <w:proofErr w:type="spellEnd"/>
+      <w:r>
+        <w:t>):</w:t>
+      </w:r>
+    </w:p>
+    <w:p>
+      <w:r>
+        <w:t xml:space="preserve">    # Display these fields in the admin list view</w:t>
+      </w:r>
+    </w:p>
+    <w:p>
+      <w:r>
+        <w:t xml:space="preserve">    </w:t>
+      </w:r>
+      <w:proofErr w:type="spellStart"/>
+      <w:r>
+        <w:t>list_display</w:t>
+      </w:r>
+      <w:proofErr w:type="spellEnd"/>
+      <w:r>
+        <w:t xml:space="preserve"> = ('username', 'email', '</w:t>
+      </w:r>
+      <w:proofErr w:type="spellStart"/>
+      <w:r>
+        <w:t>is_student</w:t>
+      </w:r>
+      <w:proofErr w:type="spellEnd"/>
+      <w:r>
+        <w:t>', '</w:t>
+      </w:r>
+      <w:proofErr w:type="spellStart"/>
+      <w:r>
+        <w:t>is_instructor</w:t>
+      </w:r>
+      <w:proofErr w:type="spellEnd"/>
+      <w:r>
+        <w:t>', '</w:t>
+      </w:r>
+      <w:proofErr w:type="spellStart"/>
+      <w:r>
+        <w:t>is_staff</w:t>
+      </w:r>
+      <w:proofErr w:type="spellEnd"/>
+      <w:r>
+        <w:t>')</w:t>
+      </w:r>
+    </w:p>
+    <w:p>
+      <w:r>
+        <w:t xml:space="preserve">    </w:t>
+      </w:r>
+    </w:p>
+    <w:p>
+      <w:r>
+        <w:t xml:space="preserve">    # Add custom fields to the user editing screen in the admin panel</w:t>
+      </w:r>
+    </w:p>
+    <w:p>
+      <w:r>
+        <w:t xml:space="preserve">    </w:t>
+      </w:r>
+      <w:proofErr w:type="spellStart"/>
+      <w:r>
+        <w:t>fieldsets</w:t>
+      </w:r>
+      <w:proofErr w:type="spellEnd"/>
+      <w:r>
+        <w:t xml:space="preserve"> = </w:t>
+      </w:r>
+      <w:proofErr w:type="spellStart"/>
+      <w:r>
+        <w:t>UserAdmin.fieldsets</w:t>
+      </w:r>
+      <w:proofErr w:type="spellEnd"/>
+      <w:r>
+        <w:t xml:space="preserve"> + (</w:t>
+      </w:r>
+    </w:p>
+    <w:p>
+      <w:r>
+        <w:t xml:space="preserve">        ('Role Info', {'fields': ('</w:t>
+      </w:r>
+      <w:proofErr w:type="spellStart"/>
+      <w:r>
+        <w:t>is_student</w:t>
+      </w:r>
+      <w:proofErr w:type="spellEnd"/>
+      <w:r>
+        <w:t>', '</w:t>
+      </w:r>
+      <w:proofErr w:type="spellStart"/>
+      <w:r>
+        <w:t>is_instructor</w:t>
+      </w:r>
+      <w:proofErr w:type="spellEnd"/>
+      <w:r>
+        <w:t>')}),</w:t>
+      </w:r>
+    </w:p>
+    <w:p>
+      <w:r>
+        <w:t xml:space="preserve">    )</w:t>
+      </w:r>
+    </w:p>
+    <w:p/>
+    <w:p>
+      <w:proofErr w:type="spellStart"/>
+      <w:r>
+        <w:t>admin.site.register</w:t>
+      </w:r>
+      <w:proofErr w:type="spellEnd"/>
+      <w:r>
+        <w:t>(</w:t>
+      </w:r>
+      <w:proofErr w:type="spellStart"/>
+      <w:r>
+        <w:t>CustomUser</w:t>
+      </w:r>
+      <w:proofErr w:type="spellEnd"/>
+      <w:r>
+        <w:t xml:space="preserve">, </w:t>
+      </w:r>
+      <w:proofErr w:type="spellStart"/>
+      <w:r>
+        <w:t>CustomUserAdmin</w:t>
+      </w:r>
+      <w:proofErr w:type="spellEnd"/>
+      <w:r>
+        <w:t>)</w:t>
+      </w:r>
+    </w:p>
+    <w:p>
+      <w:r>
+        <w:t>Finally, wire it up in config/settings.py.</w:t>
+      </w:r>
+    </w:p>
+    <w:p>
+      <w:r>
+        <w:t>Python</w:t>
+      </w:r>
+    </w:p>
+    <w:p>
+      <w:r>
+        <w:t># config/settings.py</w:t>
+      </w:r>
+    </w:p>
+    <w:p/>
+    <w:p>
+      <w:r>
+        <w:t>INSTALLED_APPS = [</w:t>
+      </w:r>
+    </w:p>
+    <w:p>
+      <w:r>
+        <w:t xml:space="preserve">    '</w:t>
+      </w:r>
+      <w:proofErr w:type="spellStart"/>
+      <w:r>
+        <w:t>django.contrib.admin</w:t>
+      </w:r>
+      <w:proofErr w:type="spellEnd"/>
+      <w:r>
+        <w:t>',</w:t>
+      </w:r>
+    </w:p>
+    <w:p>
+      <w:r>
+        <w:t xml:space="preserve">    '</w:t>
+      </w:r>
+      <w:proofErr w:type="spellStart"/>
+      <w:r>
+        <w:t>django.contrib.auth</w:t>
+      </w:r>
+      <w:proofErr w:type="spellEnd"/>
+      <w:r>
+        <w:t>',</w:t>
+      </w:r>
+    </w:p>
+    <w:p>
+      <w:r>
+        <w:t xml:space="preserve">    '</w:t>
+      </w:r>
+      <w:proofErr w:type="spellStart"/>
+      <w:r>
+        <w:t>django.contrib.contenttypes</w:t>
+      </w:r>
+      <w:proofErr w:type="spellEnd"/>
+      <w:r>
+        <w:t>',</w:t>
+      </w:r>
+    </w:p>
+    <w:p>
+      <w:r>
+        <w:t xml:space="preserve">    '</w:t>
+      </w:r>
+      <w:proofErr w:type="spellStart"/>
+      <w:r>
+        <w:t>django.contrib.sessions</w:t>
+      </w:r>
+      <w:proofErr w:type="spellEnd"/>
+      <w:r>
+        <w:t>',</w:t>
+      </w:r>
+    </w:p>
+    <w:p>
+      <w:r>
+        <w:t xml:space="preserve">    '</w:t>
+      </w:r>
+      <w:proofErr w:type="spellStart"/>
+      <w:r>
+        <w:t>django.contrib.messages</w:t>
+      </w:r>
+      <w:proofErr w:type="spellEnd"/>
+      <w:r>
+        <w:t>',</w:t>
+      </w:r>
+    </w:p>
+    <w:p>
+      <w:r>
+        <w:lastRenderedPageBreak/>
+        <w:t xml:space="preserve">    '</w:t>
+      </w:r>
+      <w:proofErr w:type="spellStart"/>
+      <w:r>
+        <w:t>django.contrib.staticfiles</w:t>
+      </w:r>
+      <w:proofErr w:type="spellEnd"/>
+      <w:r>
+        <w:t>',</w:t>
+      </w:r>
+    </w:p>
+    <w:p>
+      <w:r>
+        <w:t xml:space="preserve">    </w:t>
+      </w:r>
+    </w:p>
+    <w:p>
+      <w:r>
+        <w:t xml:space="preserve">    # Local Apps</w:t>
+      </w:r>
+    </w:p>
+    <w:p>
+      <w:r>
+        <w:t xml:space="preserve">    '</w:t>
+      </w:r>
+      <w:proofErr w:type="spellStart"/>
+      <w:r>
+        <w:t>users.apps.UsersConfig</w:t>
+      </w:r>
+      <w:proofErr w:type="spellEnd"/>
+      <w:r>
+        <w:t>', # Register your new app</w:t>
+      </w:r>
+    </w:p>
+    <w:p>
+      <w:r>
+        <w:t>]</w:t>
+      </w:r>
+    </w:p>
+    <w:p/>
+    <w:p>
+      <w:r>
+        <w:t># Tell Django to use your custom model for authentication</w:t>
+      </w:r>
+    </w:p>
+    <w:p>
+      <w:r>
+        <w:t>AUTH_USER_MODEL = '</w:t>
+      </w:r>
+      <w:proofErr w:type="spellStart"/>
+      <w:r>
+        <w:t>users.CustomUser</w:t>
+      </w:r>
+      <w:proofErr w:type="spellEnd"/>
+      <w:r>
+        <w:t>'</w:t>
+      </w:r>
+    </w:p>
+    <w:p>
+      <w:r>
+        <w:pict w14:anchorId="02635007">
+          <v:rect id="_x0000_i1028" style="width:0;height:1.5pt" o:hralign="center" o:hrstd="t" o:hr="t" fillcolor="#a0a0a0" stroked="f"/>
+        </w:pict>
+      </w:r>
+    </w:p>
+    <w:p>
+      <w:pPr>
+        <w:rPr>
+          <w:b/>
+          <w:bCs/>
+        </w:rPr>
+      </w:pPr>
+      <w:r>
+        <w:rPr>
+          <w:b/>
+          <w:bCs/>
+        </w:rPr>
+        <w:t>Step 3: Initial Migrations</w:t>
+      </w:r>
+    </w:p>
+    <w:p>
+      <w:r>
+        <w:t xml:space="preserve">Because we configured the AUTH_USER_MODEL </w:t>
+      </w:r>
+      <w:r>
+        <w:rPr>
+          <w:i/>
+          <w:iCs/>
+        </w:rPr>
+        <w:t>before</w:t>
+      </w:r>
+      <w:r>
+        <w:t xml:space="preserve"> running any migrations on Day 1, Django will cleanly build the database with your </w:t>
+      </w:r>
+      <w:proofErr w:type="spellStart"/>
+      <w:r>
+        <w:t>CustomUser</w:t>
+      </w:r>
+      <w:proofErr w:type="spellEnd"/>
+      <w:r>
+        <w:t xml:space="preserve"> at its core.</w:t>
+      </w:r>
+    </w:p>
+    <w:p>
+      <w:r>
+        <w:rPr>
+          <w:b/>
+          <w:bCs/>
+        </w:rPr>
+        <w:t>The Best Practice Execution:</w:t>
+      </w:r>
+    </w:p>
+    <w:p>
+      <w:r>
+        <w:t>Bash</w:t>
+      </w:r>
+    </w:p>
+    <w:p>
+      <w:r>
+        <w:t xml:space="preserve">python manage.py </w:t>
+      </w:r>
+      <w:proofErr w:type="spellStart"/>
+      <w:r>
+        <w:t>makemigrations</w:t>
+      </w:r>
+      <w:proofErr w:type="spellEnd"/>
+      <w:r>
+        <w:t xml:space="preserve"> users</w:t>
+      </w:r>
+    </w:p>
+    <w:p>
+      <w:r>
+        <w:t>python manage.py migrate</w:t>
+      </w:r>
+    </w:p>
+    <w:p>
+      <w:pPr>
+        <w:numPr>
+          <w:ilvl w:val="0"/>
+          <w:numId w:val="5"/>
+        </w:numPr>
+      </w:pPr>
+      <w:r>
+        <w:rPr>
+          <w:b/>
+          <w:bCs/>
+        </w:rPr>
+        <w:t>Why this matters:</w:t>
+      </w:r>
+      <w:r>
+        <w:t xml:space="preserve"> Look at the terminal output when you run this. You'll see Django migrating auth, admin, and users simultaneously, establishing the correct foreign key relationships under the hood.</w:t>
+      </w:r>
+    </w:p>
+    <w:p>
+      <w:r>
+        <w:pict w14:anchorId="3701C36E">
+          <v:rect id="_x0000_i1029" style="width:0;height:1.5pt" o:hralign="center" o:hrstd="t" o:hr="t" fillcolor="#a0a0a0" stroked="f"/>
+        </w:pict>
+      </w:r>
+    </w:p>
+    <w:p>
+      <w:pPr>
+        <w:rPr>
+          <w:b/>
+          <w:bCs/>
+        </w:rPr>
+      </w:pPr>
+      <w:r>
+        <w:rPr>
+          <w:b/>
+          <w:bCs/>
+        </w:rPr>
+        <w:t>Step 4: Commit and Pull Request (PR)</w:t>
+      </w:r>
+    </w:p>
+    <w:p>
+      <w:r>
+        <w:t>Now that the feature is complete and working locally, it's time to push it up and merge it.</w:t>
+      </w:r>
+    </w:p>
+    <w:p>
+      <w:r>
+        <w:rPr>
+          <w:b/>
+          <w:bCs/>
+        </w:rPr>
+        <w:t>The Best Practice Execution:</w:t>
+      </w:r>
+    </w:p>
+    <w:p>
+      <w:r>
+        <w:t>Bash</w:t>
+      </w:r>
+    </w:p>
+    <w:p>
+      <w:r>
+        <w:t>git add .</w:t>
+      </w:r>
+    </w:p>
+    <w:p>
+      <w:r>
+        <w:t xml:space="preserve">git commit -m "feat: implement </w:t>
+      </w:r>
+      <w:proofErr w:type="spellStart"/>
+      <w:r>
+        <w:t>CustomUser</w:t>
+      </w:r>
+      <w:proofErr w:type="spellEnd"/>
+      <w:r>
+        <w:t xml:space="preserve"> model with student/instructor roles"</w:t>
+      </w:r>
+    </w:p>
+    <w:p>
+      <w:r>
+        <w:t>git push origin feature/auth-system</w:t>
+      </w:r>
+    </w:p>
+    <w:p>
+      <w:r>
+        <w:rPr>
+          <w:b/>
+          <w:bCs/>
+        </w:rPr>
+        <w:lastRenderedPageBreak/>
+        <w:t>The PR Process (GitHub):</w:t>
+      </w:r>
+    </w:p>
+    <w:p>
+      <w:pPr>
+        <w:numPr>
+          <w:ilvl w:val="0"/>
+          <w:numId w:val="6"/>
+        </w:numPr>
+      </w:pPr>
+      <w:r>
+        <w:t xml:space="preserve">Open GitHub, and you'll see a prompt to </w:t>
+      </w:r>
+      <w:r>
+        <w:rPr>
+          <w:b/>
+          <w:bCs/>
+        </w:rPr>
+        <w:t>"Compare &amp; pull request"</w:t>
+      </w:r>
+      <w:r>
+        <w:t>.</w:t>
+      </w:r>
+    </w:p>
+    <w:p>
+      <w:pPr>
+        <w:numPr>
+          <w:ilvl w:val="0"/>
+          <w:numId w:val="6"/>
+        </w:numPr>
+      </w:pPr>
+      <w:r>
+        <w:t>Set the base branch to develop and the compare branch to feature/auth-system.</w:t>
+      </w:r>
+    </w:p>
+    <w:p>
+      <w:pPr>
+        <w:numPr>
+          <w:ilvl w:val="0"/>
+          <w:numId w:val="6"/>
+        </w:numPr>
+      </w:pPr>
+      <w:r>
+        <w:t xml:space="preserve">In a real environment, you'd tag a teammate to review the code. For now, review the file changes yourself, then click </w:t>
+      </w:r>
+      <w:r>
+        <w:rPr>
+          <w:b/>
+          <w:bCs/>
+        </w:rPr>
+        <w:t>Merge Pull Request</w:t>
+      </w:r>
+      <w:r>
+        <w:t>.</w:t>
+      </w:r>
+    </w:p>
+    <w:p>
+      <w:pPr>
+        <w:numPr>
+          <w:ilvl w:val="0"/>
+          <w:numId w:val="6"/>
+        </w:numPr>
+      </w:pPr>
+      <w:r>
+        <w:t>Once merged, clean up your local environment:</w:t>
+      </w:r>
+    </w:p>
+    <w:p>
+      <w:r>
+        <w:t>Bash</w:t>
+      </w:r>
+    </w:p>
+    <w:p>
+      <w:r>
+        <w:t># Switch back to the integration branch</w:t>
+      </w:r>
+    </w:p>
+    <w:p>
+      <w:r>
+        <w:t>git checkout develop</w:t>
+      </w:r>
+    </w:p>
+    <w:p/>
+    <w:p>
+      <w:r>
+        <w:t># Pull the newly merged code down</w:t>
+      </w:r>
+    </w:p>
+    <w:p>
+      <w:r>
+        <w:t>git pull origin develop</w:t>
+      </w:r>
+    </w:p>
+    <w:p/>
+    <w:p>
+      <w:r>
+        <w:t># Delete the local feature branch to keep your environment clean</w:t>
+      </w:r>
+    </w:p>
+    <w:p>
+      <w:r>
+        <w:t>git branch -d feature/auth-system</w:t>
+      </w:r>
+    </w:p>
+    <w:p/>
+    <w:p>
+      <w:r>
+        <w:rPr>
+          <w:noProof/>
+        </w:rPr>
+        <w:lastRenderedPageBreak/>
+        <w:drawing>
+          <wp:inline distT="0" distB="0" distL="0" distR="0" wp14:anchorId="71851DB7" wp14:editId="25065B4E">
+            <wp:extent cx="5943600" cy="3262630"/>
+            <wp:effectExtent l="0" t="0" r="0" b="0"/>
+            <wp:docPr id="1767585240" name="Picture 1"/>
+            <wp:cNvGraphicFramePr>
+              <a:graphicFrameLocks xmlns:a="http://schemas.openxmlformats.org/drawingml/2006/main" noChangeAspect="1"/>
+            </wp:cNvGraphicFramePr>
+            <a:graphic xmlns:a="http://schemas.openxmlformats.org/drawingml/2006/main">
+              <a:graphicData uri="http://schemas.openxmlformats.org/drawingml/2006/picture">
+                <pic:pic xmlns:pic="http://schemas.openxmlformats.org/drawingml/2006/picture">
+                  <pic:nvPicPr>
+                    <pic:cNvPr id="1767585240" name=""/>
+                    <pic:cNvPicPr/>
+                  </pic:nvPicPr>
+                  <pic:blipFill>
+                    <a:blip r:embed="rId5"/>
+                    <a:stretch>
+                      <a:fillRect/>
+                    </a:stretch>
+                  </pic:blipFill>
+                  <pic:spPr>
+                    <a:xfrm>
+                      <a:off x="0" y="0"/>
+                      <a:ext cx="5943600" cy="3262630"/>
+                    </a:xfrm>
+                    <a:prstGeom prst="rect">
+                      <a:avLst/>
+                    </a:prstGeom>
+                  </pic:spPr>
+                </pic:pic>
+              </a:graphicData>
+            </a:graphic>
+          </wp:inline>
+        </w:drawing>
+      </w:r>
+    </w:p>
+    <w:p>
+      <w:r>
+        <w:t>This is exactly what you want to see! You have successfully merged your first feature.</w:t>
+      </w:r>
+    </w:p>
+    <w:p>
+      <w:r>
+        <w:t xml:space="preserve">If you look closely at the middle of the screen, you'll notice it says </w:t>
+      </w:r>
+      <w:r>
+        <w:rPr>
+          <w:b/>
+          <w:bCs/>
+        </w:rPr>
+        <w:t>"1 Closed"</w:t>
+      </w:r>
+      <w:r>
+        <w:t xml:space="preserve"> next to the "0 Open" pull requests. That confirms your feature/auth-system branch was successfully merged into develop and closed out.</w:t>
+      </w:r>
+    </w:p>
+    <w:p>
+      <w:r>
+        <w:t>Here is exactly what is happening and what you should do next:</w:t>
+      </w:r>
+    </w:p>
+    <w:p>
+      <w:pPr>
+        <w:rPr>
+          <w:b/>
+          <w:bCs/>
+        </w:rPr>
+      </w:pPr>
+      <w:r>
+        <w:rPr>
+          <w:b/>
+          <w:bCs/>
+        </w:rPr>
+        <w:t>1. Ignore the Green Button</w:t>
+      </w:r>
+    </w:p>
+    <w:p>
+      <w:r>
+        <w:t xml:space="preserve">GitHub is showing the banner develop had recent pushes 1 minute ago because merging your PR updated the develop branch. GitHub's automated system is asking, </w:t>
+      </w:r>
+      <w:r>
+        <w:rPr>
+          <w:i/>
+          <w:iCs/>
+        </w:rPr>
+        <w:t>"Hey, do you want to merge these new develop changes into main?"</w:t>
+      </w:r>
+    </w:p>
+    <w:p>
+      <w:pPr>
+        <w:numPr>
+          <w:ilvl w:val="0"/>
+          <w:numId w:val="7"/>
+        </w:numPr>
+      </w:pPr>
+      <w:r>
+        <w:rPr>
+          <w:b/>
+          <w:bCs/>
+        </w:rPr>
+        <w:t>Action:</w:t>
+      </w:r>
+      <w:r>
+        <w:t xml:space="preserve"> </w:t>
+      </w:r>
+      <w:r>
+        <w:rPr>
+          <w:b/>
+          <w:bCs/>
+        </w:rPr>
+        <w:t>Do nothing here.</w:t>
+      </w:r>
+      <w:r>
+        <w:t xml:space="preserve"> In a real production sprint, we do not merge into main until the end of the sprint when all features are completely finished, tested, and ready for deployment.</w:t>
+      </w:r>
+    </w:p>
+    <w:p>
+      <w:pPr>
+        <w:rPr>
+          <w:b/>
+          <w:bCs/>
+        </w:rPr>
+      </w:pPr>
+      <w:r>
+        <w:rPr>
+          <w:b/>
+          <w:bCs/>
+        </w:rPr>
+        <w:t>2. Clean Up Your Local Environment</w:t>
+      </w:r>
+    </w:p>
+    <w:p>
+      <w:r>
+        <w:t>Now that the code is safely merged on GitHub, your local machine needs to download the updated integration code. Open your VS Code terminal or command prompt and run these commands:</w:t>
+      </w:r>
+    </w:p>
+    <w:p>
+      <w:r>
+        <w:t>Bash</w:t>
+      </w:r>
+    </w:p>
+    <w:p>
+      <w:r>
+        <w:t># 1. Switch off your feature branch and go back to the integration branch</w:t>
+      </w:r>
+    </w:p>
+    <w:p>
+      <w:r>
+        <w:t xml:space="preserve">git checkout </w:t>
+      </w:r>
+      <w:proofErr w:type="gramStart"/>
+      <w:r>
+        <w:t>develop</w:t>
+      </w:r>
+      <w:proofErr w:type="gramEnd"/>
+    </w:p>
+    <w:p/>
+    <w:p>
+      <w:r>
+        <w:t># 2. Pull down the newly merged code from GitHub</w:t>
+      </w:r>
+    </w:p>
+    <w:p>
+      <w:r>
+        <w:t>git pull origin develop</w:t>
+      </w:r>
+    </w:p>
+    <w:p/>
+    <w:p>
+      <w:r>
+        <w:t># 3. Delete your local feature branch (it's no longer needed since the code is in develop)</w:t>
+      </w:r>
+    </w:p>
+    <w:p>
+      <w:r>
+        <w:t>git branch -d feature/auth-system</w:t>
       </w:r>
     </w:p>
     <w:p/>
@@ -1141,6 +2192,453 @@
     </w:lvl>
   </w:abstractNum>
   <w:abstractNum w:abstractNumId="1" w15:restartNumberingAfterBreak="0">
+    <w:nsid w:val="0D13559B"/>
+    <w:multiLevelType w:val="multilevel"/>
+    <w:tmpl w:val="B2BA1E02"/>
+    <w:lvl w:ilvl="0">
+      <w:start w:val="1"/>
+      <w:numFmt w:val="bullet"/>
+      <w:lvlText w:val=""/>
+      <w:lvlJc w:val="left"/>
+      <w:pPr>
+        <w:tabs>
+          <w:tab w:val="num" w:pos="720"/>
+        </w:tabs>
+        <w:ind w:left="720" w:hanging="360"/>
+      </w:pPr>
+      <w:rPr>
+        <w:rFonts w:ascii="Symbol" w:hAnsi="Symbol" w:hint="default"/>
+        <w:sz w:val="20"/>
+      </w:rPr>
+    </w:lvl>
+    <w:lvl w:ilvl="1" w:tentative="1">
+      <w:start w:val="1"/>
+      <w:numFmt w:val="bullet"/>
+      <w:lvlText w:val="o"/>
+      <w:lvlJc w:val="left"/>
+      <w:pPr>
+        <w:tabs>
+          <w:tab w:val="num" w:pos="1440"/>
+        </w:tabs>
+        <w:ind w:left="1440" w:hanging="360"/>
+      </w:pPr>
+      <w:rPr>
+        <w:rFonts w:ascii="Courier New" w:hAnsi="Courier New" w:hint="default"/>
+        <w:sz w:val="20"/>
+      </w:rPr>
+    </w:lvl>
+    <w:lvl w:ilvl="2" w:tentative="1">
+      <w:start w:val="1"/>
+      <w:numFmt w:val="bullet"/>
+      <w:lvlText w:val=""/>
+      <w:lvlJc w:val="left"/>
+      <w:pPr>
+        <w:tabs>
+          <w:tab w:val="num" w:pos="2160"/>
+        </w:tabs>
+        <w:ind w:left="2160" w:hanging="360"/>
+      </w:pPr>
+      <w:rPr>
+        <w:rFonts w:ascii="Wingdings" w:hAnsi="Wingdings" w:hint="default"/>
+        <w:sz w:val="20"/>
+      </w:rPr>
+    </w:lvl>
+    <w:lvl w:ilvl="3" w:tentative="1">
+      <w:start w:val="1"/>
+      <w:numFmt w:val="bullet"/>
+      <w:lvlText w:val=""/>
+      <w:lvlJc w:val="left"/>
+      <w:pPr>
+        <w:tabs>
+          <w:tab w:val="num" w:pos="2880"/>
+        </w:tabs>
+        <w:ind w:left="2880" w:hanging="360"/>
+      </w:pPr>
+      <w:rPr>
+        <w:rFonts w:ascii="Wingdings" w:hAnsi="Wingdings" w:hint="default"/>
+        <w:sz w:val="20"/>
+      </w:rPr>
+    </w:lvl>
+    <w:lvl w:ilvl="4" w:tentative="1">
+      <w:start w:val="1"/>
+      <w:numFmt w:val="bullet"/>
+      <w:lvlText w:val=""/>
+      <w:lvlJc w:val="left"/>
+      <w:pPr>
+        <w:tabs>
+          <w:tab w:val="num" w:pos="3600"/>
+        </w:tabs>
+        <w:ind w:left="3600" w:hanging="360"/>
+      </w:pPr>
+      <w:rPr>
+        <w:rFonts w:ascii="Wingdings" w:hAnsi="Wingdings" w:hint="default"/>
+        <w:sz w:val="20"/>
+      </w:rPr>
+    </w:lvl>
+    <w:lvl w:ilvl="5" w:tentative="1">
+      <w:start w:val="1"/>
+      <w:numFmt w:val="bullet"/>
+      <w:lvlText w:val=""/>
+      <w:lvlJc w:val="left"/>
+      <w:pPr>
+        <w:tabs>
+          <w:tab w:val="num" w:pos="4320"/>
+        </w:tabs>
+        <w:ind w:left="4320" w:hanging="360"/>
+      </w:pPr>
+      <w:rPr>
+        <w:rFonts w:ascii="Wingdings" w:hAnsi="Wingdings" w:hint="default"/>
+        <w:sz w:val="20"/>
+      </w:rPr>
+    </w:lvl>
+    <w:lvl w:ilvl="6" w:tentative="1">
+      <w:start w:val="1"/>
+      <w:numFmt w:val="bullet"/>
+      <w:lvlText w:val=""/>
+      <w:lvlJc w:val="left"/>
+      <w:pPr>
+        <w:tabs>
+          <w:tab w:val="num" w:pos="5040"/>
+        </w:tabs>
+        <w:ind w:left="5040" w:hanging="360"/>
+      </w:pPr>
+      <w:rPr>
+        <w:rFonts w:ascii="Wingdings" w:hAnsi="Wingdings" w:hint="default"/>
+        <w:sz w:val="20"/>
+      </w:rPr>
+    </w:lvl>
+    <w:lvl w:ilvl="7" w:tentative="1">
+      <w:start w:val="1"/>
+      <w:numFmt w:val="bullet"/>
+      <w:lvlText w:val=""/>
+      <w:lvlJc w:val="left"/>
+      <w:pPr>
+        <w:tabs>
+          <w:tab w:val="num" w:pos="5760"/>
+        </w:tabs>
+        <w:ind w:left="5760" w:hanging="360"/>
+      </w:pPr>
+      <w:rPr>
+        <w:rFonts w:ascii="Wingdings" w:hAnsi="Wingdings" w:hint="default"/>
+        <w:sz w:val="20"/>
+      </w:rPr>
+    </w:lvl>
+    <w:lvl w:ilvl="8" w:tentative="1">
+      <w:start w:val="1"/>
+      <w:numFmt w:val="bullet"/>
+      <w:lvlText w:val=""/>
+      <w:lvlJc w:val="left"/>
+      <w:pPr>
+        <w:tabs>
+          <w:tab w:val="num" w:pos="6480"/>
+        </w:tabs>
+        <w:ind w:left="6480" w:hanging="360"/>
+      </w:pPr>
+      <w:rPr>
+        <w:rFonts w:ascii="Wingdings" w:hAnsi="Wingdings" w:hint="default"/>
+        <w:sz w:val="20"/>
+      </w:rPr>
+    </w:lvl>
+  </w:abstractNum>
+  <w:abstractNum w:abstractNumId="2" w15:restartNumberingAfterBreak="0">
+    <w:nsid w:val="21BF46DE"/>
+    <w:multiLevelType w:val="multilevel"/>
+    <w:tmpl w:val="F6D04F7E"/>
+    <w:lvl w:ilvl="0">
+      <w:start w:val="1"/>
+      <w:numFmt w:val="bullet"/>
+      <w:lvlText w:val=""/>
+      <w:lvlJc w:val="left"/>
+      <w:pPr>
+        <w:tabs>
+          <w:tab w:val="num" w:pos="720"/>
+        </w:tabs>
+        <w:ind w:left="720" w:hanging="360"/>
+      </w:pPr>
+      <w:rPr>
+        <w:rFonts w:ascii="Symbol" w:hAnsi="Symbol" w:hint="default"/>
+        <w:sz w:val="20"/>
+      </w:rPr>
+    </w:lvl>
+    <w:lvl w:ilvl="1" w:tentative="1">
+      <w:start w:val="1"/>
+      <w:numFmt w:val="bullet"/>
+      <w:lvlText w:val="o"/>
+      <w:lvlJc w:val="left"/>
+      <w:pPr>
+        <w:tabs>
+          <w:tab w:val="num" w:pos="1440"/>
+        </w:tabs>
+        <w:ind w:left="1440" w:hanging="360"/>
+      </w:pPr>
+      <w:rPr>
+        <w:rFonts w:ascii="Courier New" w:hAnsi="Courier New" w:hint="default"/>
+        <w:sz w:val="20"/>
+      </w:rPr>
+    </w:lvl>
+    <w:lvl w:ilvl="2" w:tentative="1">
+      <w:start w:val="1"/>
+      <w:numFmt w:val="bullet"/>
+      <w:lvlText w:val=""/>
+      <w:lvlJc w:val="left"/>
+      <w:pPr>
+        <w:tabs>
+          <w:tab w:val="num" w:pos="2160"/>
+        </w:tabs>
+        <w:ind w:left="2160" w:hanging="360"/>
+      </w:pPr>
+      <w:rPr>
+        <w:rFonts w:ascii="Wingdings" w:hAnsi="Wingdings" w:hint="default"/>
+        <w:sz w:val="20"/>
+      </w:rPr>
+    </w:lvl>
+    <w:lvl w:ilvl="3" w:tentative="1">
+      <w:start w:val="1"/>
+      <w:numFmt w:val="bullet"/>
+      <w:lvlText w:val=""/>
+      <w:lvlJc w:val="left"/>
+      <w:pPr>
+        <w:tabs>
+          <w:tab w:val="num" w:pos="2880"/>
+        </w:tabs>
+        <w:ind w:left="2880" w:hanging="360"/>
+      </w:pPr>
+      <w:rPr>
+        <w:rFonts w:ascii="Wingdings" w:hAnsi="Wingdings" w:hint="default"/>
+        <w:sz w:val="20"/>
+      </w:rPr>
+    </w:lvl>
+    <w:lvl w:ilvl="4" w:tentative="1">
+      <w:start w:val="1"/>
+      <w:numFmt w:val="bullet"/>
+      <w:lvlText w:val=""/>
+      <w:lvlJc w:val="left"/>
+      <w:pPr>
+        <w:tabs>
+          <w:tab w:val="num" w:pos="3600"/>
+        </w:tabs>
+        <w:ind w:left="3600" w:hanging="360"/>
+      </w:pPr>
+      <w:rPr>
+        <w:rFonts w:ascii="Wingdings" w:hAnsi="Wingdings" w:hint="default"/>
+        <w:sz w:val="20"/>
+      </w:rPr>
+    </w:lvl>
+    <w:lvl w:ilvl="5" w:tentative="1">
+      <w:start w:val="1"/>
+      <w:numFmt w:val="bullet"/>
+      <w:lvlText w:val=""/>
+      <w:lvlJc w:val="left"/>
+      <w:pPr>
+        <w:tabs>
+          <w:tab w:val="num" w:pos="4320"/>
+        </w:tabs>
+        <w:ind w:left="4320" w:hanging="360"/>
+      </w:pPr>
+      <w:rPr>
+        <w:rFonts w:ascii="Wingdings" w:hAnsi="Wingdings" w:hint="default"/>
+        <w:sz w:val="20"/>
+      </w:rPr>
+    </w:lvl>
+    <w:lvl w:ilvl="6" w:tentative="1">
+      <w:start w:val="1"/>
+      <w:numFmt w:val="bullet"/>
+      <w:lvlText w:val=""/>
+      <w:lvlJc w:val="left"/>
+      <w:pPr>
+        <w:tabs>
+          <w:tab w:val="num" w:pos="5040"/>
+        </w:tabs>
+        <w:ind w:left="5040" w:hanging="360"/>
+      </w:pPr>
+      <w:rPr>
+        <w:rFonts w:ascii="Wingdings" w:hAnsi="Wingdings" w:hint="default"/>
+        <w:sz w:val="20"/>
+      </w:rPr>
+    </w:lvl>
+    <w:lvl w:ilvl="7" w:tentative="1">
+      <w:start w:val="1"/>
+      <w:numFmt w:val="bullet"/>
+      <w:lvlText w:val=""/>
+      <w:lvlJc w:val="left"/>
+      <w:pPr>
+        <w:tabs>
+          <w:tab w:val="num" w:pos="5760"/>
+        </w:tabs>
+        <w:ind w:left="5760" w:hanging="360"/>
+      </w:pPr>
+      <w:rPr>
+        <w:rFonts w:ascii="Wingdings" w:hAnsi="Wingdings" w:hint="default"/>
+        <w:sz w:val="20"/>
+      </w:rPr>
+    </w:lvl>
+    <w:lvl w:ilvl="8" w:tentative="1">
+      <w:start w:val="1"/>
+      <w:numFmt w:val="bullet"/>
+      <w:lvlText w:val=""/>
+      <w:lvlJc w:val="left"/>
+      <w:pPr>
+        <w:tabs>
+          <w:tab w:val="num" w:pos="6480"/>
+        </w:tabs>
+        <w:ind w:left="6480" w:hanging="360"/>
+      </w:pPr>
+      <w:rPr>
+        <w:rFonts w:ascii="Wingdings" w:hAnsi="Wingdings" w:hint="default"/>
+        <w:sz w:val="20"/>
+      </w:rPr>
+    </w:lvl>
+  </w:abstractNum>
+  <w:abstractNum w:abstractNumId="3" w15:restartNumberingAfterBreak="0">
+    <w:nsid w:val="263B67A6"/>
+    <w:multiLevelType w:val="multilevel"/>
+    <w:tmpl w:val="469E7172"/>
+    <w:lvl w:ilvl="0">
+      <w:start w:val="1"/>
+      <w:numFmt w:val="bullet"/>
+      <w:lvlText w:val=""/>
+      <w:lvlJc w:val="left"/>
+      <w:pPr>
+        <w:tabs>
+          <w:tab w:val="num" w:pos="720"/>
+        </w:tabs>
+        <w:ind w:left="720" w:hanging="360"/>
+      </w:pPr>
+      <w:rPr>
+        <w:rFonts w:ascii="Symbol" w:hAnsi="Symbol" w:hint="default"/>
+        <w:sz w:val="20"/>
+      </w:rPr>
+    </w:lvl>
+    <w:lvl w:ilvl="1" w:tentative="1">
+      <w:start w:val="1"/>
+      <w:numFmt w:val="bullet"/>
+      <w:lvlText w:val="o"/>
+      <w:lvlJc w:val="left"/>
+      <w:pPr>
+        <w:tabs>
+          <w:tab w:val="num" w:pos="1440"/>
+        </w:tabs>
+        <w:ind w:left="1440" w:hanging="360"/>
+      </w:pPr>
+      <w:rPr>
+        <w:rFonts w:ascii="Courier New" w:hAnsi="Courier New" w:hint="default"/>
+        <w:sz w:val="20"/>
+      </w:rPr>
+    </w:lvl>
+    <w:lvl w:ilvl="2" w:tentative="1">
+      <w:start w:val="1"/>
+      <w:numFmt w:val="bullet"/>
+      <w:lvlText w:val=""/>
+      <w:lvlJc w:val="left"/>
+      <w:pPr>
+        <w:tabs>
+          <w:tab w:val="num" w:pos="2160"/>
+        </w:tabs>
+        <w:ind w:left="2160" w:hanging="360"/>
+      </w:pPr>
+      <w:rPr>
+        <w:rFonts w:ascii="Wingdings" w:hAnsi="Wingdings" w:hint="default"/>
+        <w:sz w:val="20"/>
+      </w:rPr>
+    </w:lvl>
+    <w:lvl w:ilvl="3" w:tentative="1">
+      <w:start w:val="1"/>
+      <w:numFmt w:val="bullet"/>
+      <w:lvlText w:val=""/>
+      <w:lvlJc w:val="left"/>
+      <w:pPr>
+        <w:tabs>
+          <w:tab w:val="num" w:pos="2880"/>
+        </w:tabs>
+        <w:ind w:left="2880" w:hanging="360"/>
+      </w:pPr>
+      <w:rPr>
+        <w:rFonts w:ascii="Wingdings" w:hAnsi="Wingdings" w:hint="default"/>
+        <w:sz w:val="20"/>
+      </w:rPr>
+    </w:lvl>
+    <w:lvl w:ilvl="4" w:tentative="1">
+      <w:start w:val="1"/>
+      <w:numFmt w:val="bullet"/>
+      <w:lvlText w:val=""/>
+      <w:lvlJc w:val="left"/>
+      <w:pPr>
+        <w:tabs>
+          <w:tab w:val="num" w:pos="3600"/>
+        </w:tabs>
+        <w:ind w:left="3600" w:hanging="360"/>
+      </w:pPr>
+      <w:rPr>
+        <w:rFonts w:ascii="Wingdings" w:hAnsi="Wingdings" w:hint="default"/>
+        <w:sz w:val="20"/>
+      </w:rPr>
+    </w:lvl>
+    <w:lvl w:ilvl="5" w:tentative="1">
+      <w:start w:val="1"/>
+      <w:numFmt w:val="bullet"/>
+      <w:lvlText w:val=""/>
+      <w:lvlJc w:val="left"/>
+      <w:pPr>
+        <w:tabs>
+          <w:tab w:val="num" w:pos="4320"/>
+        </w:tabs>
+        <w:ind w:left="4320" w:hanging="360"/>
+      </w:pPr>
+      <w:rPr>
+        <w:rFonts w:ascii="Wingdings" w:hAnsi="Wingdings" w:hint="default"/>
+        <w:sz w:val="20"/>
+      </w:rPr>
+    </w:lvl>
+    <w:lvl w:ilvl="6" w:tentative="1">
+      <w:start w:val="1"/>
+      <w:numFmt w:val="bullet"/>
+      <w:lvlText w:val=""/>
+      <w:lvlJc w:val="left"/>
+      <w:pPr>
+        <w:tabs>
+          <w:tab w:val="num" w:pos="5040"/>
+        </w:tabs>
+        <w:ind w:left="5040" w:hanging="360"/>
+      </w:pPr>
+      <w:rPr>
+        <w:rFonts w:ascii="Wingdings" w:hAnsi="Wingdings" w:hint="default"/>
+        <w:sz w:val="20"/>
+      </w:rPr>
+    </w:lvl>
+    <w:lvl w:ilvl="7" w:tentative="1">
+      <w:start w:val="1"/>
+      <w:numFmt w:val="bullet"/>
+      <w:lvlText w:val=""/>
+      <w:lvlJc w:val="left"/>
+      <w:pPr>
+        <w:tabs>
+          <w:tab w:val="num" w:pos="5760"/>
+        </w:tabs>
+        <w:ind w:left="5760" w:hanging="360"/>
+      </w:pPr>
+      <w:rPr>
+        <w:rFonts w:ascii="Wingdings" w:hAnsi="Wingdings" w:hint="default"/>
+        <w:sz w:val="20"/>
+      </w:rPr>
+    </w:lvl>
+    <w:lvl w:ilvl="8" w:tentative="1">
+      <w:start w:val="1"/>
+      <w:numFmt w:val="bullet"/>
+      <w:lvlText w:val=""/>
+      <w:lvlJc w:val="left"/>
+      <w:pPr>
+        <w:tabs>
+          <w:tab w:val="num" w:pos="6480"/>
+        </w:tabs>
+        <w:ind w:left="6480" w:hanging="360"/>
+      </w:pPr>
+      <w:rPr>
+        <w:rFonts w:ascii="Wingdings" w:hAnsi="Wingdings" w:hint="default"/>
+        <w:sz w:val="20"/>
+      </w:rPr>
+    </w:lvl>
+  </w:abstractNum>
+  <w:abstractNum w:abstractNumId="4" w15:restartNumberingAfterBreak="0">
     <w:nsid w:val="3F6F503C"/>
     <w:multiLevelType w:val="multilevel"/>
     <w:tmpl w:val="A2E0E5E6"/>
@@ -1289,7 +2787,120 @@
       </w:rPr>
     </w:lvl>
   </w:abstractNum>
-  <w:abstractNum w:abstractNumId="2" w15:restartNumberingAfterBreak="0">
+  <w:abstractNum w:abstractNumId="5" w15:restartNumberingAfterBreak="0">
+    <w:nsid w:val="5E052DFC"/>
+    <w:multiLevelType w:val="multilevel"/>
+    <w:tmpl w:val="8EC6E3EE"/>
+    <w:lvl w:ilvl="0">
+      <w:start w:val="1"/>
+      <w:numFmt w:val="decimal"/>
+      <w:lvlText w:val="%1."/>
+      <w:lvlJc w:val="left"/>
+      <w:pPr>
+        <w:tabs>
+          <w:tab w:val="num" w:pos="720"/>
+        </w:tabs>
+        <w:ind w:left="720" w:hanging="360"/>
+      </w:pPr>
+    </w:lvl>
+    <w:lvl w:ilvl="1" w:tentative="1">
+      <w:start w:val="1"/>
+      <w:numFmt w:val="decimal"/>
+      <w:lvlText w:val="%2."/>
+      <w:lvlJc w:val="left"/>
+      <w:pPr>
+        <w:tabs>
+          <w:tab w:val="num" w:pos="1440"/>
+        </w:tabs>
+        <w:ind w:left="1440" w:hanging="360"/>
+      </w:pPr>
+    </w:lvl>
+    <w:lvl w:ilvl="2" w:tentative="1">
+      <w:start w:val="1"/>
+      <w:numFmt w:val="decimal"/>
+      <w:lvlText w:val="%3."/>
+      <w:lvlJc w:val="left"/>
+      <w:pPr>
+        <w:tabs>
+          <w:tab w:val="num" w:pos="2160"/>
+        </w:tabs>
+        <w:ind w:left="2160" w:hanging="360"/>
+      </w:pPr>
+    </w:lvl>
+    <w:lvl w:ilvl="3" w:tentative="1">
+      <w:start w:val="1"/>
+      <w:numFmt w:val="decimal"/>
+      <w:lvlText w:val="%4."/>
+      <w:lvlJc w:val="left"/>
+      <w:pPr>
+        <w:tabs>
+          <w:tab w:val="num" w:pos="2880"/>
+        </w:tabs>
+        <w:ind w:left="2880" w:hanging="360"/>
+      </w:pPr>
+    </w:lvl>
+    <w:lvl w:ilvl="4" w:tentative="1">
+      <w:start w:val="1"/>
+      <w:numFmt w:val="decimal"/>
+      <w:lvlText w:val="%5."/>
+      <w:lvlJc w:val="left"/>
+      <w:pPr>
+        <w:tabs>
+          <w:tab w:val="num" w:pos="3600"/>
+        </w:tabs>
+        <w:ind w:left="3600" w:hanging="360"/>
+      </w:pPr>
+    </w:lvl>
+    <w:lvl w:ilvl="5" w:tentative="1">
+      <w:start w:val="1"/>
+      <w:numFmt w:val="decimal"/>
+      <w:lvlText w:val="%6."/>
+      <w:lvlJc w:val="left"/>
+      <w:pPr>
+        <w:tabs>
+          <w:tab w:val="num" w:pos="4320"/>
+        </w:tabs>
+        <w:ind w:left="4320" w:hanging="360"/>
+      </w:pPr>
+    </w:lvl>
+    <w:lvl w:ilvl="6" w:tentative="1">
+      <w:start w:val="1"/>
+      <w:numFmt w:val="decimal"/>
+      <w:lvlText w:val="%7."/>
+      <w:lvlJc w:val="left"/>
+      <w:pPr>
+        <w:tabs>
+          <w:tab w:val="num" w:pos="5040"/>
+        </w:tabs>
+        <w:ind w:left="5040" w:hanging="360"/>
+      </w:pPr>
+    </w:lvl>
+    <w:lvl w:ilvl="7" w:tentative="1">
+      <w:start w:val="1"/>
+      <w:numFmt w:val="decimal"/>
+      <w:lvlText w:val="%8."/>
+      <w:lvlJc w:val="left"/>
+      <w:pPr>
+        <w:tabs>
+          <w:tab w:val="num" w:pos="5760"/>
+        </w:tabs>
+        <w:ind w:left="5760" w:hanging="360"/>
+      </w:pPr>
+    </w:lvl>
+    <w:lvl w:ilvl="8" w:tentative="1">
+      <w:start w:val="1"/>
+      <w:numFmt w:val="decimal"/>
+      <w:lvlText w:val="%9."/>
+      <w:lvlJc w:val="left"/>
+      <w:pPr>
+        <w:tabs>
+          <w:tab w:val="num" w:pos="6480"/>
+        </w:tabs>
+        <w:ind w:left="6480" w:hanging="360"/>
+      </w:pPr>
+    </w:lvl>
+  </w:abstractNum>
+  <w:abstractNum w:abstractNumId="6" w15:restartNumberingAfterBreak="0">
     <w:nsid w:val="608920A3"/>
     <w:multiLevelType w:val="multilevel"/>
     <w:tmpl w:val="7966CE00"/>
@@ -1439,13 +3050,25 @@
     </w:lvl>
   </w:abstractNum>
   <w:num w:numId="1" w16cid:durableId="1089499051">
-    <w:abstractNumId w:val="2"/>
+    <w:abstractNumId w:val="6"/>
   </w:num>
   <w:num w:numId="2" w16cid:durableId="930968073">
-    <w:abstractNumId w:val="1"/>
+    <w:abstractNumId w:val="4"/>
   </w:num>
   <w:num w:numId="3" w16cid:durableId="379671181">
     <w:abstractNumId w:val="0"/>
+  </w:num>
+  <w:num w:numId="4" w16cid:durableId="1362365373">
+    <w:abstractNumId w:val="3"/>
+  </w:num>
+  <w:num w:numId="5" w16cid:durableId="1263303086">
+    <w:abstractNumId w:val="1"/>
+  </w:num>
+  <w:num w:numId="6" w16cid:durableId="1434327022">
+    <w:abstractNumId w:val="5"/>
+  </w:num>
+  <w:num w:numId="7" w16cid:durableId="282274258">
+    <w:abstractNumId w:val="2"/>
   </w:num>
 </w:numbering>
 </file>

</xml_diff>

<commit_message>
docs: update guide document
</commit_message>
<xml_diff>
--- a/guid.docx
+++ b/guid.docx
@@ -105,18 +105,13 @@
     <w:p/>
     <w:p>
       <w:r>
-        <w:t xml:space="preserve"># 3. </w:t>
-      </w:r>
-      <w:proofErr w:type="gramStart"/>
-      <w:r>
-        <w:t>Create .</w:t>
+        <w:t># 3. Create .</w:t>
       </w:r>
       <w:proofErr w:type="spellStart"/>
       <w:r>
         <w:t>gitignore</w:t>
       </w:r>
       <w:proofErr w:type="spellEnd"/>
-      <w:proofErr w:type="gramEnd"/>
       <w:r>
         <w:t xml:space="preserve"> BEFORE committing anything</w:t>
       </w:r>
@@ -1841,6 +1836,735 @@
     <w:p>
       <w:r>
         <w:t>git branch -d feature/auth-system</w:t>
+      </w:r>
+    </w:p>
+    <w:p>
+      <w:r>
+        <w:t>This is where the architecture really starts to take shape. Moving into Day 3 and Day 4 means transitioning from infrastructure to actual business value.</w:t>
+      </w:r>
+    </w:p>
+    <w:p>
+      <w:r>
+        <w:t>Separating the courses and enrollments into their own modular apps is exactly how enterprise Django projects are structured. When Charith or Lakmali jump into the codebase to build out a specific feature, keeping these domains decoupled ensures they won't step on each other's toes or cause massive merge conflicts.</w:t>
+      </w:r>
+    </w:p>
+    <w:p>
+      <w:r>
+        <w:t>Here is the exact execution plan, leveled up with the code snippets and industry best practices required for production.</w:t>
+      </w:r>
+    </w:p>
+    <w:p>
+      <w:r>
+        <w:pict w14:anchorId="3865E4D0">
+          <v:rect id="_x0000_i1036" style="width:0;height:1.5pt" o:hralign="center" o:hrstd="t" o:hr="t" fillcolor="#a0a0a0" stroked="f"/>
+        </w:pict>
+      </w:r>
+    </w:p>
+    <w:p>
+      <w:pPr>
+        <w:rPr>
+          <w:b/>
+          <w:bCs/>
+        </w:rPr>
+      </w:pPr>
+      <w:r>
+        <w:rPr>
+          <w:b/>
+          <w:bCs/>
+        </w:rPr>
+        <w:t>Day 3: Core Domain Models</w:t>
+      </w:r>
+    </w:p>
+    <w:p>
+      <w:r>
+        <w:t xml:space="preserve">We are building the database schema. The critical best practice here is </w:t>
+      </w:r>
+      <w:r>
+        <w:rPr>
+          <w:b/>
+          <w:bCs/>
+        </w:rPr>
+        <w:t>never importing your Custom User model directly</w:t>
+      </w:r>
+      <w:r>
+        <w:t xml:space="preserve">. Always use </w:t>
+      </w:r>
+      <w:proofErr w:type="spellStart"/>
+      <w:r>
+        <w:t>settings.AUTH_USER_MODEL</w:t>
+      </w:r>
+      <w:proofErr w:type="spellEnd"/>
+      <w:r>
+        <w:t xml:space="preserve"> to define relationships, which prevents circular import errors.</w:t>
+      </w:r>
+    </w:p>
+    <w:p>
+      <w:pPr>
+        <w:rPr>
+          <w:b/>
+          <w:bCs/>
+        </w:rPr>
+      </w:pPr>
+      <w:r>
+        <w:rPr>
+          <w:b/>
+          <w:bCs/>
+        </w:rPr>
+        <w:t>1. Create the Feature Branch</w:t>
+      </w:r>
+    </w:p>
+    <w:p>
+      <w:r>
+        <w:lastRenderedPageBreak/>
+        <w:t>Always start by syncing with the integration branch.</w:t>
+      </w:r>
+    </w:p>
+    <w:p>
+      <w:r>
+        <w:t>Bash</w:t>
+      </w:r>
+    </w:p>
+    <w:p>
+      <w:r>
+        <w:t>git checkout develop</w:t>
+      </w:r>
+    </w:p>
+    <w:p>
+      <w:r>
+        <w:t>git pull origin develop</w:t>
+      </w:r>
+    </w:p>
+    <w:p>
+      <w:r>
+        <w:t>git checkout -b feature/course-domain</w:t>
+      </w:r>
+    </w:p>
+    <w:p>
+      <w:pPr>
+        <w:rPr>
+          <w:b/>
+          <w:bCs/>
+        </w:rPr>
+      </w:pPr>
+      <w:r>
+        <w:rPr>
+          <w:b/>
+          <w:bCs/>
+        </w:rPr>
+        <w:t>2. Build the Apps and Models</w:t>
+      </w:r>
+    </w:p>
+    <w:p>
+      <w:r>
+        <w:t>Generate the two decoupled applications:</w:t>
+      </w:r>
+    </w:p>
+    <w:p>
+      <w:r>
+        <w:t>Bash</w:t>
+      </w:r>
+    </w:p>
+    <w:p>
+      <w:r>
+        <w:t xml:space="preserve">python manage.py </w:t>
+      </w:r>
+      <w:proofErr w:type="spellStart"/>
+      <w:r>
+        <w:t>startapp</w:t>
+      </w:r>
+      <w:proofErr w:type="spellEnd"/>
+      <w:r>
+        <w:t xml:space="preserve"> courses</w:t>
+      </w:r>
+    </w:p>
+    <w:p>
+      <w:r>
+        <w:t xml:space="preserve">python manage.py </w:t>
+      </w:r>
+      <w:proofErr w:type="spellStart"/>
+      <w:r>
+        <w:t>startapp</w:t>
+      </w:r>
+      <w:proofErr w:type="spellEnd"/>
+      <w:r>
+        <w:t xml:space="preserve"> enrollments</w:t>
+      </w:r>
+    </w:p>
+    <w:p>
+      <w:r>
+        <w:rPr>
+          <w:b/>
+          <w:bCs/>
+        </w:rPr>
+        <w:t>Register the Apps:</w:t>
+      </w:r>
+      <w:r>
+        <w:t xml:space="preserve"> Immediately add them to your config/settings.py under INSTALLED_APPS:</w:t>
+      </w:r>
+    </w:p>
+    <w:p>
+      <w:r>
+        <w:t>Python</w:t>
+      </w:r>
+    </w:p>
+    <w:p>
+      <w:r>
+        <w:t>INSTALLED_APPS = [</w:t>
+      </w:r>
+    </w:p>
+    <w:p>
+      <w:r>
+        <w:t xml:space="preserve">    # ... previous apps ...</w:t>
+      </w:r>
+    </w:p>
+    <w:p>
+      <w:r>
+        <w:t xml:space="preserve">    '</w:t>
+      </w:r>
+      <w:proofErr w:type="spellStart"/>
+      <w:r>
+        <w:t>users.apps.UsersConfig</w:t>
+      </w:r>
+      <w:proofErr w:type="spellEnd"/>
+      <w:r>
+        <w:t>',</w:t>
+      </w:r>
+    </w:p>
+    <w:p>
+      <w:r>
+        <w:t xml:space="preserve">    '</w:t>
+      </w:r>
+      <w:proofErr w:type="spellStart"/>
+      <w:r>
+        <w:t>courses.apps.CoursesConfig</w:t>
+      </w:r>
+      <w:proofErr w:type="spellEnd"/>
+      <w:r>
+        <w:t>',</w:t>
+      </w:r>
+    </w:p>
+    <w:p>
+      <w:r>
+        <w:t xml:space="preserve">    '</w:t>
+      </w:r>
+      <w:proofErr w:type="spellStart"/>
+      <w:r>
+        <w:t>enrollments.apps.EnrollmentsConfig</w:t>
+      </w:r>
+      <w:proofErr w:type="spellEnd"/>
+      <w:r>
+        <w:t>',</w:t>
+      </w:r>
+    </w:p>
+    <w:p>
+      <w:r>
+        <w:t>]</w:t>
+      </w:r>
+    </w:p>
+    <w:p>
+      <w:r>
+        <w:rPr>
+          <w:b/>
+          <w:bCs/>
+        </w:rPr>
+        <w:t>The Course Model (courses/models.py):</w:t>
+      </w:r>
+    </w:p>
+    <w:p>
+      <w:r>
+        <w:t>Python</w:t>
+      </w:r>
+    </w:p>
+    <w:p>
+      <w:r>
+        <w:t xml:space="preserve">from </w:t>
+      </w:r>
+      <w:proofErr w:type="spellStart"/>
+      <w:r>
+        <w:t>django.db</w:t>
+      </w:r>
+      <w:proofErr w:type="spellEnd"/>
+      <w:r>
+        <w:t xml:space="preserve"> import models</w:t>
+      </w:r>
+    </w:p>
+    <w:p/>
+    <w:p>
+      <w:r>
+        <w:t>class Course(</w:t>
+      </w:r>
+      <w:proofErr w:type="spellStart"/>
+      <w:r>
+        <w:t>models.Model</w:t>
+      </w:r>
+      <w:proofErr w:type="spellEnd"/>
+      <w:r>
+        <w:t>):</w:t>
+      </w:r>
+    </w:p>
+    <w:p>
+      <w:r>
+        <w:t xml:space="preserve">    title = </w:t>
+      </w:r>
+      <w:proofErr w:type="spellStart"/>
+      <w:r>
+        <w:t>models.CharField</w:t>
+      </w:r>
+      <w:proofErr w:type="spellEnd"/>
+      <w:r>
+        <w:t>(</w:t>
+      </w:r>
+      <w:proofErr w:type="spellStart"/>
+      <w:r>
+        <w:t>max_length</w:t>
+      </w:r>
+      <w:proofErr w:type="spellEnd"/>
+      <w:r>
+        <w:t>=255)</w:t>
+      </w:r>
+    </w:p>
+    <w:p>
+      <w:r>
+        <w:t xml:space="preserve">    description = </w:t>
+      </w:r>
+      <w:proofErr w:type="spellStart"/>
+      <w:r>
+        <w:t>models.TextField</w:t>
+      </w:r>
+      <w:proofErr w:type="spellEnd"/>
+      <w:r>
+        <w:t>()</w:t>
+      </w:r>
+    </w:p>
+    <w:p>
+      <w:r>
+        <w:lastRenderedPageBreak/>
+        <w:t xml:space="preserve">    capacity = </w:t>
+      </w:r>
+      <w:proofErr w:type="spellStart"/>
+      <w:r>
+        <w:t>models.PositiveIntegerField</w:t>
+      </w:r>
+      <w:proofErr w:type="spellEnd"/>
+      <w:r>
+        <w:t>(default=30)</w:t>
+      </w:r>
+    </w:p>
+    <w:p>
+      <w:r>
+        <w:t xml:space="preserve">    </w:t>
+      </w:r>
+      <w:proofErr w:type="spellStart"/>
+      <w:r>
+        <w:t>is_active</w:t>
+      </w:r>
+      <w:proofErr w:type="spellEnd"/>
+      <w:r>
+        <w:t xml:space="preserve"> = </w:t>
+      </w:r>
+      <w:proofErr w:type="spellStart"/>
+      <w:r>
+        <w:t>models.BooleanField</w:t>
+      </w:r>
+      <w:proofErr w:type="spellEnd"/>
+      <w:r>
+        <w:t>(default=True)</w:t>
+      </w:r>
+    </w:p>
+    <w:p>
+      <w:r>
+        <w:t xml:space="preserve">    </w:t>
+      </w:r>
+      <w:proofErr w:type="spellStart"/>
+      <w:r>
+        <w:t>created_at</w:t>
+      </w:r>
+      <w:proofErr w:type="spellEnd"/>
+      <w:r>
+        <w:t xml:space="preserve"> = </w:t>
+      </w:r>
+      <w:proofErr w:type="spellStart"/>
+      <w:r>
+        <w:t>models.DateTimeField</w:t>
+      </w:r>
+      <w:proofErr w:type="spellEnd"/>
+      <w:r>
+        <w:t>(</w:t>
+      </w:r>
+      <w:proofErr w:type="spellStart"/>
+      <w:r>
+        <w:t>auto_now_add</w:t>
+      </w:r>
+      <w:proofErr w:type="spellEnd"/>
+      <w:r>
+        <w:t>=True)</w:t>
+      </w:r>
+    </w:p>
+    <w:p/>
+    <w:p>
+      <w:r>
+        <w:t xml:space="preserve">    def __str__(self):</w:t>
+      </w:r>
+    </w:p>
+    <w:p>
+      <w:r>
+        <w:t xml:space="preserve">        return </w:t>
+      </w:r>
+      <w:proofErr w:type="spellStart"/>
+      <w:r>
+        <w:t>self.title</w:t>
+      </w:r>
+      <w:proofErr w:type="spellEnd"/>
+    </w:p>
+    <w:p>
+      <w:r>
+        <w:rPr>
+          <w:b/>
+          <w:bCs/>
+        </w:rPr>
+        <w:t>The Enrollment Model (enrollments/models.py):</w:t>
+      </w:r>
+      <w:r>
+        <w:t xml:space="preserve"> This acts as the intermediary table mapping the student to the course.</w:t>
+      </w:r>
+    </w:p>
+    <w:p>
+      <w:r>
+        <w:t>Python</w:t>
+      </w:r>
+    </w:p>
+    <w:p>
+      <w:r>
+        <w:t xml:space="preserve">from </w:t>
+      </w:r>
+      <w:proofErr w:type="spellStart"/>
+      <w:r>
+        <w:t>django.db</w:t>
+      </w:r>
+      <w:proofErr w:type="spellEnd"/>
+      <w:r>
+        <w:t xml:space="preserve"> import models</w:t>
+      </w:r>
+    </w:p>
+    <w:p>
+      <w:r>
+        <w:t xml:space="preserve">from </w:t>
+      </w:r>
+      <w:proofErr w:type="spellStart"/>
+      <w:r>
+        <w:t>django.conf</w:t>
+      </w:r>
+      <w:proofErr w:type="spellEnd"/>
+      <w:r>
+        <w:t xml:space="preserve"> import settings</w:t>
+      </w:r>
+    </w:p>
+    <w:p>
+      <w:r>
+        <w:t xml:space="preserve">from </w:t>
+      </w:r>
+      <w:proofErr w:type="spellStart"/>
+      <w:r>
+        <w:t>courses.models</w:t>
+      </w:r>
+      <w:proofErr w:type="spellEnd"/>
+      <w:r>
+        <w:t xml:space="preserve"> import Course</w:t>
+      </w:r>
+    </w:p>
+    <w:p/>
+    <w:p>
+      <w:r>
+        <w:t>class Enrollment(</w:t>
+      </w:r>
+      <w:proofErr w:type="spellStart"/>
+      <w:r>
+        <w:t>models.Model</w:t>
+      </w:r>
+      <w:proofErr w:type="spellEnd"/>
+      <w:r>
+        <w:t>):</w:t>
+      </w:r>
+    </w:p>
+    <w:p>
+      <w:r>
+        <w:t xml:space="preserve">    STATUS_CHOICES = [</w:t>
+      </w:r>
+    </w:p>
+    <w:p>
+      <w:r>
+        <w:t xml:space="preserve">        ('active', 'Active'),</w:t>
+      </w:r>
+    </w:p>
+    <w:p>
+      <w:r>
+        <w:t xml:space="preserve">        ('completed', 'Completed'),</w:t>
+      </w:r>
+    </w:p>
+    <w:p>
+      <w:r>
+        <w:t xml:space="preserve">        ('dropped', 'Dropped'),</w:t>
+      </w:r>
+    </w:p>
+    <w:p>
+      <w:r>
+        <w:t xml:space="preserve">    ]</w:t>
+      </w:r>
+    </w:p>
+    <w:p/>
+    <w:p>
+      <w:r>
+        <w:t xml:space="preserve">    # BEST PRACTICE: Reference the user model via settings</w:t>
+      </w:r>
+    </w:p>
+    <w:p>
+      <w:r>
+        <w:t xml:space="preserve">    student = </w:t>
+      </w:r>
+      <w:proofErr w:type="spellStart"/>
+      <w:r>
+        <w:t>models.ForeignKey</w:t>
+      </w:r>
+      <w:proofErr w:type="spellEnd"/>
+      <w:r>
+        <w:t>(</w:t>
+      </w:r>
+      <w:proofErr w:type="spellStart"/>
+      <w:r>
+        <w:t>settings.AUTH_USER_MODEL</w:t>
+      </w:r>
+      <w:proofErr w:type="spellEnd"/>
+      <w:r>
+        <w:t xml:space="preserve">, </w:t>
+      </w:r>
+      <w:proofErr w:type="spellStart"/>
+      <w:r>
+        <w:t>on_delete</w:t>
+      </w:r>
+      <w:proofErr w:type="spellEnd"/>
+      <w:r>
+        <w:t>=</w:t>
+      </w:r>
+      <w:proofErr w:type="spellStart"/>
+      <w:r>
+        <w:t>models.CASCADE</w:t>
+      </w:r>
+      <w:proofErr w:type="spellEnd"/>
+      <w:r>
+        <w:t xml:space="preserve">, </w:t>
+      </w:r>
+      <w:proofErr w:type="spellStart"/>
+      <w:r>
+        <w:t>related_name</w:t>
+      </w:r>
+      <w:proofErr w:type="spellEnd"/>
+      <w:r>
+        <w:t>='enrollments')</w:t>
+      </w:r>
+    </w:p>
+    <w:p>
+      <w:r>
+        <w:t xml:space="preserve">    course = </w:t>
+      </w:r>
+      <w:proofErr w:type="spellStart"/>
+      <w:r>
+        <w:t>models.ForeignKey</w:t>
+      </w:r>
+      <w:proofErr w:type="spellEnd"/>
+      <w:r>
+        <w:t xml:space="preserve">(Course, </w:t>
+      </w:r>
+      <w:proofErr w:type="spellStart"/>
+      <w:r>
+        <w:t>on_delete</w:t>
+      </w:r>
+      <w:proofErr w:type="spellEnd"/>
+      <w:r>
+        <w:t>=</w:t>
+      </w:r>
+      <w:proofErr w:type="spellStart"/>
+      <w:r>
+        <w:t>models.CASCADE</w:t>
+      </w:r>
+      <w:proofErr w:type="spellEnd"/>
+      <w:r>
+        <w:t xml:space="preserve">, </w:t>
+      </w:r>
+      <w:proofErr w:type="spellStart"/>
+      <w:r>
+        <w:t>related_name</w:t>
+      </w:r>
+      <w:proofErr w:type="spellEnd"/>
+      <w:r>
+        <w:t>='enrollments')</w:t>
+      </w:r>
+    </w:p>
+    <w:p>
+      <w:r>
+        <w:t xml:space="preserve">    status = </w:t>
+      </w:r>
+      <w:proofErr w:type="spellStart"/>
+      <w:r>
+        <w:t>models.CharField</w:t>
+      </w:r>
+      <w:proofErr w:type="spellEnd"/>
+      <w:r>
+        <w:t>(</w:t>
+      </w:r>
+      <w:proofErr w:type="spellStart"/>
+      <w:r>
+        <w:t>max_length</w:t>
+      </w:r>
+      <w:proofErr w:type="spellEnd"/>
+      <w:r>
+        <w:t>=20, choices=STATUS_CHOICES, default='active')</w:t>
+      </w:r>
+    </w:p>
+    <w:p>
+      <w:r>
+        <w:t xml:space="preserve">    </w:t>
+      </w:r>
+      <w:proofErr w:type="spellStart"/>
+      <w:r>
+        <w:t>enrollment_date</w:t>
+      </w:r>
+      <w:proofErr w:type="spellEnd"/>
+      <w:r>
+        <w:t xml:space="preserve"> = </w:t>
+      </w:r>
+      <w:proofErr w:type="spellStart"/>
+      <w:r>
+        <w:t>models.DateTimeField</w:t>
+      </w:r>
+      <w:proofErr w:type="spellEnd"/>
+      <w:r>
+        <w:t>(</w:t>
+      </w:r>
+      <w:proofErr w:type="spellStart"/>
+      <w:r>
+        <w:t>auto_now_add</w:t>
+      </w:r>
+      <w:proofErr w:type="spellEnd"/>
+      <w:r>
+        <w:t>=True)</w:t>
+      </w:r>
+    </w:p>
+    <w:p/>
+    <w:p>
+      <w:r>
+        <w:t xml:space="preserve">    class Meta:</w:t>
+      </w:r>
+    </w:p>
+    <w:p>
+      <w:r>
+        <w:t xml:space="preserve">        # Prevent a student from enrolling in the exact same course twice</w:t>
+      </w:r>
+    </w:p>
+    <w:p>
+      <w:r>
+        <w:t xml:space="preserve">        </w:t>
+      </w:r>
+      <w:proofErr w:type="spellStart"/>
+      <w:r>
+        <w:t>unique_together</w:t>
+      </w:r>
+      <w:proofErr w:type="spellEnd"/>
+      <w:r>
+        <w:t xml:space="preserve"> = ('student', 'course')</w:t>
+      </w:r>
+    </w:p>
+    <w:p/>
+    <w:p>
+      <w:r>
+        <w:t xml:space="preserve">    def __str__(self):</w:t>
+      </w:r>
+    </w:p>
+    <w:p>
+      <w:r>
+        <w:t xml:space="preserve">        return f"{</w:t>
+      </w:r>
+      <w:proofErr w:type="spellStart"/>
+      <w:r>
+        <w:t>self.student.username</w:t>
+      </w:r>
+      <w:proofErr w:type="spellEnd"/>
+      <w:r>
+        <w:t>} - {</w:t>
+      </w:r>
+      <w:proofErr w:type="spellStart"/>
+      <w:r>
+        <w:t>self.course.title</w:t>
+      </w:r>
+      <w:proofErr w:type="spellEnd"/>
+      <w:r>
+        <w:t>}"</w:t>
+      </w:r>
+    </w:p>
+    <w:p>
+      <w:pPr>
+        <w:rPr>
+          <w:b/>
+          <w:bCs/>
+        </w:rPr>
+      </w:pPr>
+      <w:r>
+        <w:rPr>
+          <w:b/>
+          <w:bCs/>
+        </w:rPr>
+        <w:t>3. Migrate &amp; Push</w:t>
+      </w:r>
+    </w:p>
+    <w:p>
+      <w:r>
+        <w:t>Generate the SQL tables and push the branch.</w:t>
+      </w:r>
+    </w:p>
+    <w:p>
+      <w:r>
+        <w:t>Bash</w:t>
+      </w:r>
+    </w:p>
+    <w:p>
+      <w:r>
+        <w:t xml:space="preserve">python manage.py </w:t>
+      </w:r>
+      <w:proofErr w:type="spellStart"/>
+      <w:r>
+        <w:t>makemigrations</w:t>
+      </w:r>
+      <w:proofErr w:type="spellEnd"/>
+    </w:p>
+    <w:p>
+      <w:r>
+        <w:t>python manage.py migrate</w:t>
+      </w:r>
+    </w:p>
+    <w:p>
+      <w:r>
+        <w:t>git add .</w:t>
+      </w:r>
+    </w:p>
+    <w:p>
+      <w:r>
+        <w:t>git commit -m "feat: add course and enrollment data models with strict relationships"</w:t>
+      </w:r>
+    </w:p>
+    <w:p>
+      <w:r>
+        <w:t>git push origin feature/course-domain</w:t>
+      </w:r>
+    </w:p>
+    <w:p>
+      <w:r>
+        <w:rPr>
+          <w:b/>
+          <w:bCs/>
+        </w:rPr>
+        <w:t>Action:</w:t>
+      </w:r>
+      <w:r>
+        <w:t xml:space="preserve"> Go to GitHub, open the Pull Request, review the schema, and merge into develop. Clean up locally (git checkout develop, git pull, git branch -d feature/course-domain).</w:t>
       </w:r>
     </w:p>
     <w:p/>
@@ -1999,13 +2723,8 @@
     </w:p>
     <w:p>
       <w:r>
-        <w:t xml:space="preserve">git checkout </w:t>
-      </w:r>
-      <w:proofErr w:type="gramStart"/>
-      <w:r>
-        <w:t>develop</w:t>
-      </w:r>
-      <w:proofErr w:type="gramEnd"/>
+        <w:t>git checkout develop</w:t>
+      </w:r>
     </w:p>
     <w:p/>
     <w:p>

</xml_diff>

<commit_message>
feat: add course and enrollment data models
</commit_message>
<xml_diff>
--- a/guid.docx
+++ b/guid.docx
@@ -62,29 +62,14 @@
       </w:r>
     </w:p>
     <w:p>
-      <w:proofErr w:type="spellStart"/>
-      <w:r>
-        <w:t>mkdir</w:t>
-      </w:r>
-      <w:proofErr w:type="spellEnd"/>
-      <w:r>
-        <w:t xml:space="preserve"> </w:t>
-      </w:r>
-      <w:proofErr w:type="spellStart"/>
-      <w:r>
-        <w:t>edusys_platform</w:t>
-      </w:r>
-      <w:proofErr w:type="spellEnd"/>
-    </w:p>
-    <w:p>
-      <w:r>
-        <w:t xml:space="preserve">cd </w:t>
-      </w:r>
-      <w:proofErr w:type="spellStart"/>
-      <w:r>
-        <w:t>edusys_platform</w:t>
-      </w:r>
-      <w:proofErr w:type="spellEnd"/>
+      <w:r>
+        <w:t>mkdir edusys_platform</w:t>
+      </w:r>
+    </w:p>
+    <w:p>
+      <w:r>
+        <w:t>cd edusys_platform</w:t>
+      </w:r>
     </w:p>
     <w:p/>
     <w:p>
@@ -94,103 +79,38 @@
     </w:p>
     <w:p>
       <w:r>
-        <w:t xml:space="preserve">git </w:t>
-      </w:r>
-      <w:proofErr w:type="spellStart"/>
-      <w:r>
-        <w:t>init</w:t>
-      </w:r>
-      <w:proofErr w:type="spellEnd"/>
+        <w:t>git init</w:t>
+      </w:r>
     </w:p>
     <w:p/>
     <w:p>
       <w:r>
-        <w:t># 3. Create .</w:t>
-      </w:r>
-      <w:proofErr w:type="spellStart"/>
-      <w:r>
-        <w:t>gitignore</w:t>
-      </w:r>
-      <w:proofErr w:type="spellEnd"/>
-      <w:r>
-        <w:t xml:space="preserve"> BEFORE committing anything</w:t>
-      </w:r>
-    </w:p>
-    <w:p>
-      <w:r>
-        <w:t>echo "</w:t>
-      </w:r>
-      <w:proofErr w:type="spellStart"/>
-      <w:r>
-        <w:t>venv</w:t>
-      </w:r>
-      <w:proofErr w:type="spellEnd"/>
-      <w:r>
-        <w:t>/" &gt; .</w:t>
-      </w:r>
-      <w:proofErr w:type="spellStart"/>
-      <w:r>
-        <w:t>gitignore</w:t>
-      </w:r>
-      <w:proofErr w:type="spellEnd"/>
-    </w:p>
-    <w:p>
-      <w:r>
-        <w:t>echo "*.</w:t>
-      </w:r>
-      <w:proofErr w:type="spellStart"/>
-      <w:r>
-        <w:t>pyc</w:t>
-      </w:r>
-      <w:proofErr w:type="spellEnd"/>
-      <w:r>
-        <w:t>" &gt;&gt; .</w:t>
-      </w:r>
-      <w:proofErr w:type="spellStart"/>
-      <w:r>
-        <w:t>gitignore</w:t>
-      </w:r>
-      <w:proofErr w:type="spellEnd"/>
-    </w:p>
-    <w:p>
-      <w:r>
-        <w:t>echo ".env" &gt;&gt; .</w:t>
-      </w:r>
-      <w:proofErr w:type="spellStart"/>
-      <w:r>
-        <w:t>gitignore</w:t>
-      </w:r>
-      <w:proofErr w:type="spellEnd"/>
-    </w:p>
-    <w:p>
-      <w:r>
-        <w:t>echo "__</w:t>
-      </w:r>
-      <w:proofErr w:type="spellStart"/>
-      <w:r>
-        <w:t>pycache</w:t>
-      </w:r>
-      <w:proofErr w:type="spellEnd"/>
-      <w:r>
-        <w:t>__/" &gt;&gt; .</w:t>
-      </w:r>
-      <w:proofErr w:type="spellStart"/>
-      <w:r>
-        <w:t>gitignore</w:t>
-      </w:r>
-      <w:proofErr w:type="spellEnd"/>
-    </w:p>
-    <w:p>
-      <w:r>
-        <w:t>echo "db.sqlite3" &gt;&gt; .</w:t>
-      </w:r>
-      <w:proofErr w:type="spellStart"/>
-      <w:r>
-        <w:t>gitignore</w:t>
-      </w:r>
-      <w:proofErr w:type="spellEnd"/>
-      <w:r>
-        <w:t xml:space="preserve">  # Just in case you fallback to SQLite temporarily</w:t>
+        <w:t># 3. Create .gitignore BEFORE committing anything</w:t>
+      </w:r>
+    </w:p>
+    <w:p>
+      <w:r>
+        <w:t>echo "venv/" &gt; .gitignore</w:t>
+      </w:r>
+    </w:p>
+    <w:p>
+      <w:r>
+        <w:t>echo "*.pyc" &gt;&gt; .gitignore</w:t>
+      </w:r>
+    </w:p>
+    <w:p>
+      <w:r>
+        <w:t>echo ".env" &gt;&gt; .gitignore</w:t>
+      </w:r>
+    </w:p>
+    <w:p>
+      <w:r>
+        <w:t>echo "__pycache__/" &gt;&gt; .gitignore</w:t>
+      </w:r>
+    </w:p>
+    <w:p>
+      <w:r>
+        <w:t>echo "db.sqlite3" &gt;&gt; .gitignore  # Just in case you fallback to SQLite temporarily</w:t>
       </w:r>
     </w:p>
     <w:p/>
@@ -201,41 +121,12 @@
     </w:p>
     <w:p>
       <w:r>
-        <w:t xml:space="preserve">python -m </w:t>
-      </w:r>
-      <w:proofErr w:type="spellStart"/>
-      <w:r>
-        <w:t>venv</w:t>
-      </w:r>
-      <w:proofErr w:type="spellEnd"/>
-      <w:r>
-        <w:t xml:space="preserve"> </w:t>
-      </w:r>
-      <w:proofErr w:type="spellStart"/>
-      <w:r>
-        <w:t>venv</w:t>
-      </w:r>
-      <w:proofErr w:type="spellEnd"/>
-    </w:p>
-    <w:p>
-      <w:r>
-        <w:t xml:space="preserve">source </w:t>
-      </w:r>
-      <w:proofErr w:type="spellStart"/>
-      <w:r>
-        <w:t>venv</w:t>
-      </w:r>
-      <w:proofErr w:type="spellEnd"/>
-      <w:r>
-        <w:t xml:space="preserve">/bin/activate  # Windows: </w:t>
-      </w:r>
-      <w:proofErr w:type="spellStart"/>
-      <w:r>
-        <w:t>venv</w:t>
-      </w:r>
-      <w:proofErr w:type="spellEnd"/>
-      <w:r>
-        <w:t>\Scripts\activate</w:t>
+        <w:t>python -m venv venv</w:t>
+      </w:r>
+    </w:p>
+    <w:p>
+      <w:r>
+        <w:t>source venv/bin/activate  # Windows: venv\Scripts\activate</w:t>
       </w:r>
     </w:p>
     <w:p/>
@@ -251,29 +142,8 @@
     </w:p>
     <w:p>
       <w:r>
-        <w:t xml:space="preserve">pip install </w:t>
-      </w:r>
-      <w:proofErr w:type="spellStart"/>
-      <w:r>
-        <w:t>django</w:t>
-      </w:r>
-      <w:proofErr w:type="spellEnd"/>
-      <w:r>
-        <w:t xml:space="preserve"> </w:t>
-      </w:r>
-      <w:proofErr w:type="spellStart"/>
-      <w:r>
-        <w:t>mysqlclient</w:t>
-      </w:r>
-      <w:proofErr w:type="spellEnd"/>
-      <w:r>
-        <w:t xml:space="preserve"> python-</w:t>
-      </w:r>
-      <w:proofErr w:type="spellStart"/>
-      <w:r>
-        <w:t>dotenv</w:t>
-      </w:r>
-      <w:proofErr w:type="spellEnd"/>
+        <w:t>pip install django mysqlclient python-dotenv</w:t>
+      </w:r>
     </w:p>
     <w:p/>
     <w:p>
@@ -301,15 +171,7 @@
         <w:t>Why this matters:</w:t>
       </w:r>
       <w:r>
-        <w:t xml:space="preserve"> When your team clones this repo, they will simply run pip install -r requirements.txt. Because .env is in the .</w:t>
-      </w:r>
-      <w:proofErr w:type="spellStart"/>
-      <w:r>
-        <w:t>gitignore</w:t>
-      </w:r>
-      <w:proofErr w:type="spellEnd"/>
-      <w:r>
-        <w:t>, you guarantee that no one accidentally commits database passwords to version control—a critical security standard, especially when handling complex or predictive data platforms.</w:t>
+        <w:t xml:space="preserve"> When your team clones this repo, they will simply run pip install -r requirements.txt. Because .env is in the .gitignore, you guarantee that no one accidentally commits database passwords to version control—a critical security standard, especially when handling complex or predictive data platforms.</w:t>
       </w:r>
     </w:p>
     <w:p>
@@ -336,15 +198,7 @@
     </w:p>
     <w:p>
       <w:r>
-        <w:t>You mentioned using python-</w:t>
-      </w:r>
-      <w:proofErr w:type="spellStart"/>
-      <w:r>
-        <w:t>dotenv</w:t>
-      </w:r>
-      <w:proofErr w:type="spellEnd"/>
-      <w:r>
-        <w:t>, which is the exact right move. Hardcoding credentials in settings.py is a massive security vulnerability.</w:t>
+        <w:t>You mentioned using python-dotenv, which is the exact right move. Hardcoding credentials in settings.py is a massive security vulnerability.</w:t>
       </w:r>
     </w:p>
     <w:p>
@@ -367,21 +221,8 @@
       </w:r>
     </w:p>
     <w:p>
-      <w:proofErr w:type="spellStart"/>
-      <w:r>
-        <w:t>django</w:t>
-      </w:r>
-      <w:proofErr w:type="spellEnd"/>
-      <w:r>
-        <w:t xml:space="preserve">-admin </w:t>
-      </w:r>
-      <w:proofErr w:type="spellStart"/>
-      <w:r>
-        <w:t>startproject</w:t>
-      </w:r>
-      <w:proofErr w:type="spellEnd"/>
-      <w:r>
-        <w:t xml:space="preserve"> config .</w:t>
+      <w:r>
+        <w:t>django-admin startproject config .</w:t>
       </w:r>
     </w:p>
     <w:p>
@@ -401,15 +242,7 @@
     </w:p>
     <w:p>
       <w:r>
-        <w:t>SECRET_KEY=your-super-secret-</w:t>
-      </w:r>
-      <w:proofErr w:type="spellStart"/>
-      <w:r>
-        <w:t>django</w:t>
-      </w:r>
-      <w:proofErr w:type="spellEnd"/>
-      <w:r>
-        <w:t>-key-here</w:t>
+        <w:t>SECRET_KEY=your-super-secret-django-key-here</w:t>
       </w:r>
     </w:p>
     <w:p>
@@ -419,13 +252,8 @@
     </w:p>
     <w:p>
       <w:r>
-        <w:t>DB_NAME=</w:t>
-      </w:r>
-      <w:proofErr w:type="spellStart"/>
-      <w:r>
-        <w:t>edusys_db</w:t>
-      </w:r>
-      <w:proofErr w:type="spellEnd"/>
+        <w:t>DB_NAME=edusys_db</w:t>
+      </w:r>
     </w:p>
     <w:p>
       <w:r>
@@ -434,13 +262,8 @@
     </w:p>
     <w:p>
       <w:r>
-        <w:t>DB_PASSWORD=</w:t>
-      </w:r>
-      <w:proofErr w:type="spellStart"/>
-      <w:r>
-        <w:t>your_mysql_password</w:t>
-      </w:r>
-      <w:proofErr w:type="spellEnd"/>
+        <w:t>DB_PASSWORD=your_mysql_password</w:t>
+      </w:r>
     </w:p>
     <w:p>
       <w:r>
@@ -455,15 +278,7 @@
     </w:p>
     <w:p>
       <w:r>
-        <w:t xml:space="preserve">Then, update config/settings.py to read these variables securely. Add the </w:t>
-      </w:r>
-      <w:proofErr w:type="spellStart"/>
-      <w:r>
-        <w:t>dotenv</w:t>
-      </w:r>
-      <w:proofErr w:type="spellEnd"/>
-      <w:r>
-        <w:t xml:space="preserve"> setup right at the top, below the standard imports:</w:t>
+        <w:t>Then, update config/settings.py to read these variables securely. Add the dotenv setup right at the top, below the standard imports:</w:t>
       </w:r>
     </w:p>
     <w:p>
@@ -478,44 +293,18 @@
     </w:p>
     <w:p>
       <w:r>
-        <w:t xml:space="preserve">import </w:t>
-      </w:r>
-      <w:proofErr w:type="spellStart"/>
-      <w:r>
-        <w:t>os</w:t>
-      </w:r>
-      <w:proofErr w:type="spellEnd"/>
-    </w:p>
-    <w:p>
-      <w:r>
-        <w:t xml:space="preserve">from </w:t>
-      </w:r>
-      <w:proofErr w:type="spellStart"/>
-      <w:r>
-        <w:t>pathlib</w:t>
-      </w:r>
-      <w:proofErr w:type="spellEnd"/>
-      <w:r>
-        <w:t xml:space="preserve"> import Path</w:t>
-      </w:r>
-    </w:p>
-    <w:p>
-      <w:r>
-        <w:t xml:space="preserve">from </w:t>
-      </w:r>
-      <w:proofErr w:type="spellStart"/>
-      <w:r>
-        <w:t>dotenv</w:t>
-      </w:r>
-      <w:proofErr w:type="spellEnd"/>
-      <w:r>
-        <w:t xml:space="preserve"> import </w:t>
-      </w:r>
-      <w:proofErr w:type="spellStart"/>
-      <w:r>
-        <w:t>load_dotenv</w:t>
-      </w:r>
-      <w:proofErr w:type="spellEnd"/>
+        <w:t>import os</w:t>
+      </w:r>
+    </w:p>
+    <w:p>
+      <w:r>
+        <w:t>from pathlib import Path</w:t>
+      </w:r>
+    </w:p>
+    <w:p>
+      <w:r>
+        <w:t>from dotenv import load_dotenv</w:t>
+      </w:r>
     </w:p>
     <w:p/>
     <w:p>
@@ -525,13 +314,8 @@
     </w:p>
     <w:p>
       <w:r>
-        <w:t>BASE_DIR = Path(__file__).resolve().</w:t>
-      </w:r>
-      <w:proofErr w:type="spellStart"/>
-      <w:r>
-        <w:t>parent.parent</w:t>
-      </w:r>
-      <w:proofErr w:type="spellEnd"/>
+        <w:t>BASE_DIR = Path(__file__).resolve().parent.parent</w:t>
+      </w:r>
     </w:p>
     <w:p/>
     <w:p>
@@ -540,21 +324,8 @@
       </w:r>
     </w:p>
     <w:p>
-      <w:proofErr w:type="spellStart"/>
-      <w:r>
-        <w:t>load_dotenv</w:t>
-      </w:r>
-      <w:proofErr w:type="spellEnd"/>
-      <w:r>
-        <w:t>(</w:t>
-      </w:r>
-      <w:proofErr w:type="spellStart"/>
-      <w:r>
-        <w:t>os.path.join</w:t>
-      </w:r>
-      <w:proofErr w:type="spellEnd"/>
-      <w:r>
-        <w:t>(BASE_DIR, '.env'))</w:t>
+      <w:r>
+        <w:t>load_dotenv(os.path.join(BASE_DIR, '.env'))</w:t>
       </w:r>
     </w:p>
     <w:p/>
@@ -565,15 +336,7 @@
     </w:p>
     <w:p>
       <w:r>
-        <w:t xml:space="preserve">SECRET_KEY = </w:t>
-      </w:r>
-      <w:proofErr w:type="spellStart"/>
-      <w:r>
-        <w:t>os.environ.get</w:t>
-      </w:r>
-      <w:proofErr w:type="spellEnd"/>
-      <w:r>
-        <w:t>('SECRET_KEY')</w:t>
+        <w:t>SECRET_KEY = os.environ.get('SECRET_KEY')</w:t>
       </w:r>
     </w:p>
     <w:p/>
@@ -584,15 +347,7 @@
     </w:p>
     <w:p>
       <w:r>
-        <w:t xml:space="preserve">DEBUG = </w:t>
-      </w:r>
-      <w:proofErr w:type="spellStart"/>
-      <w:r>
-        <w:t>os.environ.get</w:t>
-      </w:r>
-      <w:proofErr w:type="spellEnd"/>
-      <w:r>
-        <w:t>('DEBUG') == 'True'</w:t>
+        <w:t>DEBUG = os.environ.get('DEBUG') == 'True'</w:t>
       </w:r>
     </w:p>
     <w:p/>
@@ -615,80 +370,32 @@
     <w:p>
       <w:r>
         <w:lastRenderedPageBreak/>
-        <w:t xml:space="preserve">        'ENGINE': '</w:t>
-      </w:r>
-      <w:proofErr w:type="spellStart"/>
-      <w:r>
-        <w:t>django.db.backends.mysql</w:t>
-      </w:r>
-      <w:proofErr w:type="spellEnd"/>
-      <w:r>
-        <w:t>',</w:t>
-      </w:r>
-    </w:p>
-    <w:p>
-      <w:r>
-        <w:t xml:space="preserve">        'NAME': </w:t>
-      </w:r>
-      <w:proofErr w:type="spellStart"/>
-      <w:r>
-        <w:t>os.environ.get</w:t>
-      </w:r>
-      <w:proofErr w:type="spellEnd"/>
-      <w:r>
-        <w:t>('DB_NAME'),</w:t>
-      </w:r>
-    </w:p>
-    <w:p>
-      <w:r>
-        <w:t xml:space="preserve">        'USER': </w:t>
-      </w:r>
-      <w:proofErr w:type="spellStart"/>
-      <w:r>
-        <w:t>os.environ.get</w:t>
-      </w:r>
-      <w:proofErr w:type="spellEnd"/>
-      <w:r>
-        <w:t>('DB_USER'),</w:t>
-      </w:r>
-    </w:p>
-    <w:p>
-      <w:r>
-        <w:t xml:space="preserve">        'PASSWORD': </w:t>
-      </w:r>
-      <w:proofErr w:type="spellStart"/>
-      <w:r>
-        <w:t>os.environ.get</w:t>
-      </w:r>
-      <w:proofErr w:type="spellEnd"/>
-      <w:r>
-        <w:t>('DB_PASSWORD'),</w:t>
-      </w:r>
-    </w:p>
-    <w:p>
-      <w:r>
-        <w:t xml:space="preserve">        'HOST': </w:t>
-      </w:r>
-      <w:proofErr w:type="spellStart"/>
-      <w:r>
-        <w:t>os.environ.get</w:t>
-      </w:r>
-      <w:proofErr w:type="spellEnd"/>
-      <w:r>
-        <w:t>('DB_HOST'),</w:t>
-      </w:r>
-    </w:p>
-    <w:p>
-      <w:r>
-        <w:t xml:space="preserve">        'PORT': </w:t>
-      </w:r>
-      <w:proofErr w:type="spellStart"/>
-      <w:r>
-        <w:t>os.environ.get</w:t>
-      </w:r>
-      <w:proofErr w:type="spellEnd"/>
-      <w:r>
-        <w:t>('DB_PORT'),</w:t>
+        <w:t xml:space="preserve">        'ENGINE': 'django.db.backends.mysql',</w:t>
+      </w:r>
+    </w:p>
+    <w:p>
+      <w:r>
+        <w:t xml:space="preserve">        'NAME': os.environ.get('DB_NAME'),</w:t>
+      </w:r>
+    </w:p>
+    <w:p>
+      <w:r>
+        <w:t xml:space="preserve">        'USER': os.environ.get('DB_USER'),</w:t>
+      </w:r>
+    </w:p>
+    <w:p>
+      <w:r>
+        <w:t xml:space="preserve">        'PASSWORD': os.environ.get('DB_PASSWORD'),</w:t>
+      </w:r>
+    </w:p>
+    <w:p>
+      <w:r>
+        <w:t xml:space="preserve">        'HOST': os.environ.get('DB_HOST'),</w:t>
+      </w:r>
+    </w:p>
+    <w:p>
+      <w:r>
+        <w:t xml:space="preserve">        'PORT': os.environ.get('DB_PORT'),</w:t>
       </w:r>
     </w:p>
     <w:p>
@@ -698,23 +405,7 @@
     </w:p>
     <w:p>
       <w:r>
-        <w:t xml:space="preserve">            '</w:t>
-      </w:r>
-      <w:proofErr w:type="spellStart"/>
-      <w:r>
-        <w:t>init_command</w:t>
-      </w:r>
-      <w:proofErr w:type="spellEnd"/>
-      <w:r>
-        <w:t xml:space="preserve">': "SET </w:t>
-      </w:r>
-      <w:proofErr w:type="spellStart"/>
-      <w:r>
-        <w:t>sql_mode</w:t>
-      </w:r>
-      <w:proofErr w:type="spellEnd"/>
-      <w:r>
-        <w:t>='STRICT_TRANS_TABLES'",</w:t>
+        <w:t xml:space="preserve">            'init_command': "SET sql_mode='STRICT_TRANS_TABLES'",</w:t>
       </w:r>
     </w:p>
     <w:p>
@@ -863,23 +554,7 @@
     </w:p>
     <w:p>
       <w:r>
-        <w:t xml:space="preserve">By locking this down now, when Charith, </w:t>
-      </w:r>
-      <w:proofErr w:type="spellStart"/>
-      <w:r>
-        <w:t>Withana</w:t>
-      </w:r>
-      <w:proofErr w:type="spellEnd"/>
-      <w:r>
-        <w:t xml:space="preserve">, Lakmali, and </w:t>
-      </w:r>
-      <w:proofErr w:type="spellStart"/>
-      <w:r>
-        <w:t>Nawarathna</w:t>
-      </w:r>
-      <w:proofErr w:type="spellEnd"/>
-      <w:r>
-        <w:t xml:space="preserve"> pull the repository, they will be building their features on top of a solid, extensible identity system.</w:t>
+        <w:t>By locking this down now, when Charith, Withana, Lakmali, and Nawarathna pull the repository, they will be building their features on top of a solid, extensible identity system.</w:t>
       </w:r>
     </w:p>
     <w:p>
@@ -1009,28 +684,12 @@
     </w:p>
     <w:p>
       <w:r>
-        <w:t xml:space="preserve">python manage.py </w:t>
-      </w:r>
-      <w:proofErr w:type="spellStart"/>
-      <w:r>
-        <w:t>startapp</w:t>
-      </w:r>
-      <w:proofErr w:type="spellEnd"/>
-      <w:r>
-        <w:t xml:space="preserve"> users</w:t>
-      </w:r>
-    </w:p>
-    <w:p>
-      <w:r>
-        <w:t xml:space="preserve">Next, define the model in users/models.py. Inheriting from </w:t>
-      </w:r>
-      <w:proofErr w:type="spellStart"/>
-      <w:r>
-        <w:t>AbstractUser</w:t>
-      </w:r>
-      <w:proofErr w:type="spellEnd"/>
-      <w:r>
-        <w:t xml:space="preserve"> is perfect because it gives you Django's built-in authentication (passwords, hashing, permissions) while letting you add custom fields.</w:t>
+        <w:t>python manage.py startapp users</w:t>
+      </w:r>
+    </w:p>
+    <w:p>
+      <w:r>
+        <w:t>Next, define the model in users/models.py. Inheriting from AbstractUser is perfect because it gives you Django's built-in authentication (passwords, hashing, permissions) while letting you add custom fields.</w:t>
       </w:r>
     </w:p>
     <w:p>
@@ -1045,55 +704,18 @@
     </w:p>
     <w:p>
       <w:r>
-        <w:t xml:space="preserve">from </w:t>
-      </w:r>
-      <w:proofErr w:type="spellStart"/>
-      <w:r>
-        <w:t>django.contrib.auth.models</w:t>
-      </w:r>
-      <w:proofErr w:type="spellEnd"/>
-      <w:r>
-        <w:t xml:space="preserve"> import </w:t>
-      </w:r>
-      <w:proofErr w:type="spellStart"/>
-      <w:r>
-        <w:t>AbstractUser</w:t>
-      </w:r>
-      <w:proofErr w:type="spellEnd"/>
-    </w:p>
-    <w:p>
-      <w:r>
-        <w:t xml:space="preserve">from </w:t>
-      </w:r>
-      <w:proofErr w:type="spellStart"/>
-      <w:r>
-        <w:t>django.db</w:t>
-      </w:r>
-      <w:proofErr w:type="spellEnd"/>
-      <w:r>
-        <w:t xml:space="preserve"> import models</w:t>
+        <w:t>from django.contrib.auth.models import AbstractUser</w:t>
+      </w:r>
+    </w:p>
+    <w:p>
+      <w:r>
+        <w:t>from django.db import models</w:t>
       </w:r>
     </w:p>
     <w:p/>
     <w:p>
       <w:r>
-        <w:t xml:space="preserve">class </w:t>
-      </w:r>
-      <w:proofErr w:type="spellStart"/>
-      <w:r>
-        <w:t>CustomUser</w:t>
-      </w:r>
-      <w:proofErr w:type="spellEnd"/>
-      <w:r>
-        <w:t>(</w:t>
-      </w:r>
-      <w:proofErr w:type="spellStart"/>
-      <w:r>
-        <w:t>AbstractUser</w:t>
-      </w:r>
-      <w:proofErr w:type="spellEnd"/>
-      <w:r>
-        <w:t>):</w:t>
+        <w:t>class CustomUser(AbstractUser):</w:t>
       </w:r>
     </w:p>
     <w:p>
@@ -1103,86 +725,33 @@
     </w:p>
     <w:p>
       <w:r>
+        <w:t xml:space="preserve">    is_student = models.BooleanField(default=False)</w:t>
+      </w:r>
+    </w:p>
+    <w:p>
+      <w:r>
+        <w:t xml:space="preserve">    is_instructor = models.BooleanField(default=False)</w:t>
+      </w:r>
+    </w:p>
+    <w:p>
+      <w:r>
         <w:t xml:space="preserve">    </w:t>
       </w:r>
-      <w:proofErr w:type="spellStart"/>
-      <w:r>
-        <w:t>is_student</w:t>
-      </w:r>
-      <w:proofErr w:type="spellEnd"/>
-      <w:r>
-        <w:t xml:space="preserve"> = </w:t>
-      </w:r>
-      <w:proofErr w:type="spellStart"/>
-      <w:r>
-        <w:t>models.BooleanField</w:t>
-      </w:r>
-      <w:proofErr w:type="spellEnd"/>
-      <w:r>
-        <w:t>(default=False)</w:t>
+    </w:p>
+    <w:p>
+      <w:r>
+        <w:t xml:space="preserve">    # Best practice: Add related_name to avoid clashes if you ever use auth.User</w:t>
+      </w:r>
+    </w:p>
+    <w:p>
+      <w:r>
+        <w:t xml:space="preserve">    # You can also add things like 'bio' or 'profile_picture' later.</w:t>
       </w:r>
     </w:p>
     <w:p>
       <w:r>
         <w:t xml:space="preserve">    </w:t>
       </w:r>
-      <w:proofErr w:type="spellStart"/>
-      <w:r>
-        <w:t>is_instructor</w:t>
-      </w:r>
-      <w:proofErr w:type="spellEnd"/>
-      <w:r>
-        <w:t xml:space="preserve"> = </w:t>
-      </w:r>
-      <w:proofErr w:type="spellStart"/>
-      <w:r>
-        <w:t>models.BooleanField</w:t>
-      </w:r>
-      <w:proofErr w:type="spellEnd"/>
-      <w:r>
-        <w:t>(default=False)</w:t>
-      </w:r>
-    </w:p>
-    <w:p>
-      <w:r>
-        <w:t xml:space="preserve">    </w:t>
-      </w:r>
-    </w:p>
-    <w:p>
-      <w:r>
-        <w:t xml:space="preserve">    # Best practice: Add </w:t>
-      </w:r>
-      <w:proofErr w:type="spellStart"/>
-      <w:r>
-        <w:t>related_name</w:t>
-      </w:r>
-      <w:proofErr w:type="spellEnd"/>
-      <w:r>
-        <w:t xml:space="preserve"> to avoid clashes if you ever use </w:t>
-      </w:r>
-      <w:proofErr w:type="spellStart"/>
-      <w:r>
-        <w:t>auth.User</w:t>
-      </w:r>
-      <w:proofErr w:type="spellEnd"/>
-    </w:p>
-    <w:p>
-      <w:r>
-        <w:t xml:space="preserve">    # You can also add things like 'bio' or '</w:t>
-      </w:r>
-      <w:proofErr w:type="spellStart"/>
-      <w:r>
-        <w:t>profile_picture</w:t>
-      </w:r>
-      <w:proofErr w:type="spellEnd"/>
-      <w:r>
-        <w:t>' later.</w:t>
-      </w:r>
-    </w:p>
-    <w:p>
-      <w:r>
-        <w:t xml:space="preserve">    </w:t>
-      </w:r>
     </w:p>
     <w:p>
       <w:r>
@@ -1191,13 +760,8 @@
     </w:p>
     <w:p>
       <w:r>
-        <w:t xml:space="preserve">        return </w:t>
-      </w:r>
-      <w:proofErr w:type="spellStart"/>
-      <w:r>
-        <w:t>self.username</w:t>
-      </w:r>
-      <w:proofErr w:type="spellEnd"/>
+        <w:t xml:space="preserve">        return self.username</w:t>
+      </w:r>
     </w:p>
     <w:p>
       <w:r>
@@ -1234,65 +798,23 @@
     </w:p>
     <w:p>
       <w:r>
-        <w:t xml:space="preserve">from </w:t>
-      </w:r>
-      <w:proofErr w:type="spellStart"/>
-      <w:r>
-        <w:t>django.contrib</w:t>
-      </w:r>
-      <w:proofErr w:type="spellEnd"/>
-      <w:r>
-        <w:t xml:space="preserve"> import admin</w:t>
-      </w:r>
-    </w:p>
-    <w:p>
-      <w:r>
-        <w:t xml:space="preserve">from </w:t>
-      </w:r>
-      <w:proofErr w:type="spellStart"/>
-      <w:r>
-        <w:t>django.contrib.auth.admin</w:t>
-      </w:r>
-      <w:proofErr w:type="spellEnd"/>
-      <w:r>
-        <w:t xml:space="preserve"> import </w:t>
-      </w:r>
-      <w:proofErr w:type="spellStart"/>
-      <w:r>
-        <w:t>UserAdmin</w:t>
-      </w:r>
-      <w:proofErr w:type="spellEnd"/>
-    </w:p>
-    <w:p>
-      <w:r>
-        <w:t xml:space="preserve">from .models import </w:t>
-      </w:r>
-      <w:proofErr w:type="spellStart"/>
-      <w:r>
-        <w:t>CustomUser</w:t>
-      </w:r>
-      <w:proofErr w:type="spellEnd"/>
+        <w:t>from django.contrib import admin</w:t>
+      </w:r>
+    </w:p>
+    <w:p>
+      <w:r>
+        <w:t>from django.contrib.auth.admin import UserAdmin</w:t>
+      </w:r>
+    </w:p>
+    <w:p>
+      <w:r>
+        <w:t>from .models import CustomUser</w:t>
+      </w:r>
     </w:p>
     <w:p/>
     <w:p>
       <w:r>
-        <w:t xml:space="preserve">class </w:t>
-      </w:r>
-      <w:proofErr w:type="spellStart"/>
-      <w:r>
-        <w:t>CustomUserAdmin</w:t>
-      </w:r>
-      <w:proofErr w:type="spellEnd"/>
-      <w:r>
-        <w:t>(</w:t>
-      </w:r>
-      <w:proofErr w:type="spellStart"/>
-      <w:r>
-        <w:t>UserAdmin</w:t>
-      </w:r>
-      <w:proofErr w:type="spellEnd"/>
-      <w:r>
-        <w:t>):</w:t>
+        <w:t>class CustomUserAdmin(UserAdmin):</w:t>
       </w:r>
     </w:p>
     <w:p>
@@ -1302,39 +824,90 @@
     </w:p>
     <w:p>
       <w:r>
+        <w:t xml:space="preserve">    list_display = ('username', 'email', 'is_student', 'is_instructor', 'is_staff')</w:t>
+      </w:r>
+    </w:p>
+    <w:p>
+      <w:r>
         <w:t xml:space="preserve">    </w:t>
       </w:r>
-      <w:proofErr w:type="spellStart"/>
-      <w:r>
-        <w:t>list_display</w:t>
-      </w:r>
-      <w:proofErr w:type="spellEnd"/>
-      <w:r>
-        <w:t xml:space="preserve"> = ('username', 'email', '</w:t>
-      </w:r>
-      <w:proofErr w:type="spellStart"/>
-      <w:r>
-        <w:t>is_student</w:t>
-      </w:r>
-      <w:proofErr w:type="spellEnd"/>
-      <w:r>
-        <w:t>', '</w:t>
-      </w:r>
-      <w:proofErr w:type="spellStart"/>
-      <w:r>
-        <w:t>is_instructor</w:t>
-      </w:r>
-      <w:proofErr w:type="spellEnd"/>
-      <w:r>
-        <w:t>', '</w:t>
-      </w:r>
-      <w:proofErr w:type="spellStart"/>
-      <w:r>
-        <w:t>is_staff</w:t>
-      </w:r>
-      <w:proofErr w:type="spellEnd"/>
-      <w:r>
-        <w:t>')</w:t>
+    </w:p>
+    <w:p>
+      <w:r>
+        <w:t xml:space="preserve">    # Add custom fields to the user editing screen in the admin panel</w:t>
+      </w:r>
+    </w:p>
+    <w:p>
+      <w:r>
+        <w:t xml:space="preserve">    fieldsets = UserAdmin.fieldsets + (</w:t>
+      </w:r>
+    </w:p>
+    <w:p>
+      <w:r>
+        <w:t xml:space="preserve">        ('Role Info', {'fields': ('is_student', 'is_instructor')}),</w:t>
+      </w:r>
+    </w:p>
+    <w:p>
+      <w:r>
+        <w:t xml:space="preserve">    )</w:t>
+      </w:r>
+    </w:p>
+    <w:p/>
+    <w:p>
+      <w:r>
+        <w:t>admin.site.register(CustomUser, CustomUserAdmin)</w:t>
+      </w:r>
+    </w:p>
+    <w:p>
+      <w:r>
+        <w:t>Finally, wire it up in config/settings.py.</w:t>
+      </w:r>
+    </w:p>
+    <w:p>
+      <w:r>
+        <w:t>Python</w:t>
+      </w:r>
+    </w:p>
+    <w:p>
+      <w:r>
+        <w:t># config/settings.py</w:t>
+      </w:r>
+    </w:p>
+    <w:p/>
+    <w:p>
+      <w:r>
+        <w:t>INSTALLED_APPS = [</w:t>
+      </w:r>
+    </w:p>
+    <w:p>
+      <w:r>
+        <w:t xml:space="preserve">    'django.contrib.admin',</w:t>
+      </w:r>
+    </w:p>
+    <w:p>
+      <w:r>
+        <w:t xml:space="preserve">    'django.contrib.auth',</w:t>
+      </w:r>
+    </w:p>
+    <w:p>
+      <w:r>
+        <w:t xml:space="preserve">    'django.contrib.contenttypes',</w:t>
+      </w:r>
+    </w:p>
+    <w:p>
+      <w:r>
+        <w:t xml:space="preserve">    'django.contrib.sessions',</w:t>
+      </w:r>
+    </w:p>
+    <w:p>
+      <w:r>
+        <w:t xml:space="preserve">    'django.contrib.messages',</w:t>
+      </w:r>
+    </w:p>
+    <w:p>
+      <w:r>
+        <w:lastRenderedPageBreak/>
+        <w:t xml:space="preserve">    'django.contrib.staticfiles',</w:t>
       </w:r>
     </w:p>
     <w:p>
@@ -1344,228 +917,28 @@
     </w:p>
     <w:p>
       <w:r>
-        <w:t xml:space="preserve">    # Add custom fields to the user editing screen in the admin panel</w:t>
-      </w:r>
-    </w:p>
-    <w:p>
-      <w:r>
-        <w:t xml:space="preserve">    </w:t>
-      </w:r>
-      <w:proofErr w:type="spellStart"/>
-      <w:r>
-        <w:t>fieldsets</w:t>
-      </w:r>
-      <w:proofErr w:type="spellEnd"/>
-      <w:r>
-        <w:t xml:space="preserve"> = </w:t>
-      </w:r>
-      <w:proofErr w:type="spellStart"/>
-      <w:r>
-        <w:t>UserAdmin.fieldsets</w:t>
-      </w:r>
-      <w:proofErr w:type="spellEnd"/>
-      <w:r>
-        <w:t xml:space="preserve"> + (</w:t>
-      </w:r>
-    </w:p>
-    <w:p>
-      <w:r>
-        <w:t xml:space="preserve">        ('Role Info', {'fields': ('</w:t>
-      </w:r>
-      <w:proofErr w:type="spellStart"/>
-      <w:r>
-        <w:t>is_student</w:t>
-      </w:r>
-      <w:proofErr w:type="spellEnd"/>
-      <w:r>
-        <w:t>', '</w:t>
-      </w:r>
-      <w:proofErr w:type="spellStart"/>
-      <w:r>
-        <w:t>is_instructor</w:t>
-      </w:r>
-      <w:proofErr w:type="spellEnd"/>
-      <w:r>
-        <w:t>')}),</w:t>
-      </w:r>
-    </w:p>
-    <w:p>
-      <w:r>
-        <w:t xml:space="preserve">    )</w:t>
+        <w:t xml:space="preserve">    # Local Apps</w:t>
+      </w:r>
+    </w:p>
+    <w:p>
+      <w:r>
+        <w:t xml:space="preserve">    'users.apps.UsersConfig', # Register your new app</w:t>
+      </w:r>
+    </w:p>
+    <w:p>
+      <w:r>
+        <w:t>]</w:t>
       </w:r>
     </w:p>
     <w:p/>
     <w:p>
-      <w:proofErr w:type="spellStart"/>
-      <w:r>
-        <w:t>admin.site.register</w:t>
-      </w:r>
-      <w:proofErr w:type="spellEnd"/>
-      <w:r>
-        <w:t>(</w:t>
-      </w:r>
-      <w:proofErr w:type="spellStart"/>
-      <w:r>
-        <w:t>CustomUser</w:t>
-      </w:r>
-      <w:proofErr w:type="spellEnd"/>
-      <w:r>
-        <w:t xml:space="preserve">, </w:t>
-      </w:r>
-      <w:proofErr w:type="spellStart"/>
-      <w:r>
-        <w:t>CustomUserAdmin</w:t>
-      </w:r>
-      <w:proofErr w:type="spellEnd"/>
-      <w:r>
-        <w:t>)</w:t>
-      </w:r>
-    </w:p>
-    <w:p>
-      <w:r>
-        <w:t>Finally, wire it up in config/settings.py.</w:t>
-      </w:r>
-    </w:p>
-    <w:p>
-      <w:r>
-        <w:t>Python</w:t>
-      </w:r>
-    </w:p>
-    <w:p>
-      <w:r>
-        <w:t># config/settings.py</w:t>
-      </w:r>
-    </w:p>
-    <w:p/>
-    <w:p>
-      <w:r>
-        <w:t>INSTALLED_APPS = [</w:t>
-      </w:r>
-    </w:p>
-    <w:p>
-      <w:r>
-        <w:t xml:space="preserve">    '</w:t>
-      </w:r>
-      <w:proofErr w:type="spellStart"/>
-      <w:r>
-        <w:t>django.contrib.admin</w:t>
-      </w:r>
-      <w:proofErr w:type="spellEnd"/>
-      <w:r>
-        <w:t>',</w:t>
-      </w:r>
-    </w:p>
-    <w:p>
-      <w:r>
-        <w:t xml:space="preserve">    '</w:t>
-      </w:r>
-      <w:proofErr w:type="spellStart"/>
-      <w:r>
-        <w:t>django.contrib.auth</w:t>
-      </w:r>
-      <w:proofErr w:type="spellEnd"/>
-      <w:r>
-        <w:t>',</w:t>
-      </w:r>
-    </w:p>
-    <w:p>
-      <w:r>
-        <w:t xml:space="preserve">    '</w:t>
-      </w:r>
-      <w:proofErr w:type="spellStart"/>
-      <w:r>
-        <w:t>django.contrib.contenttypes</w:t>
-      </w:r>
-      <w:proofErr w:type="spellEnd"/>
-      <w:r>
-        <w:t>',</w:t>
-      </w:r>
-    </w:p>
-    <w:p>
-      <w:r>
-        <w:t xml:space="preserve">    '</w:t>
-      </w:r>
-      <w:proofErr w:type="spellStart"/>
-      <w:r>
-        <w:t>django.contrib.sessions</w:t>
-      </w:r>
-      <w:proofErr w:type="spellEnd"/>
-      <w:r>
-        <w:t>',</w:t>
-      </w:r>
-    </w:p>
-    <w:p>
-      <w:r>
-        <w:t xml:space="preserve">    '</w:t>
-      </w:r>
-      <w:proofErr w:type="spellStart"/>
-      <w:r>
-        <w:t>django.contrib.messages</w:t>
-      </w:r>
-      <w:proofErr w:type="spellEnd"/>
-      <w:r>
-        <w:t>',</w:t>
-      </w:r>
-    </w:p>
-    <w:p>
-      <w:r>
-        <w:lastRenderedPageBreak/>
-        <w:t xml:space="preserve">    '</w:t>
-      </w:r>
-      <w:proofErr w:type="spellStart"/>
-      <w:r>
-        <w:t>django.contrib.staticfiles</w:t>
-      </w:r>
-      <w:proofErr w:type="spellEnd"/>
-      <w:r>
-        <w:t>',</w:t>
-      </w:r>
-    </w:p>
-    <w:p>
-      <w:r>
-        <w:t xml:space="preserve">    </w:t>
-      </w:r>
-    </w:p>
-    <w:p>
-      <w:r>
-        <w:t xml:space="preserve">    # Local Apps</w:t>
-      </w:r>
-    </w:p>
-    <w:p>
-      <w:r>
-        <w:t xml:space="preserve">    '</w:t>
-      </w:r>
-      <w:proofErr w:type="spellStart"/>
-      <w:r>
-        <w:t>users.apps.UsersConfig</w:t>
-      </w:r>
-      <w:proofErr w:type="spellEnd"/>
-      <w:r>
-        <w:t>', # Register your new app</w:t>
-      </w:r>
-    </w:p>
-    <w:p>
-      <w:r>
-        <w:t>]</w:t>
-      </w:r>
-    </w:p>
-    <w:p/>
-    <w:p>
       <w:r>
         <w:t># Tell Django to use your custom model for authentication</w:t>
       </w:r>
     </w:p>
     <w:p>
       <w:r>
-        <w:t>AUTH_USER_MODEL = '</w:t>
-      </w:r>
-      <w:proofErr w:type="spellStart"/>
-      <w:r>
-        <w:t>users.CustomUser</w:t>
-      </w:r>
-      <w:proofErr w:type="spellEnd"/>
-      <w:r>
-        <w:t>'</w:t>
+        <w:t>AUTH_USER_MODEL = 'users.CustomUser'</w:t>
       </w:r>
     </w:p>
     <w:p>
@@ -1602,15 +975,7 @@
         <w:t>before</w:t>
       </w:r>
       <w:r>
-        <w:t xml:space="preserve"> running any migrations on Day 1, Django will cleanly build the database with your </w:t>
-      </w:r>
-      <w:proofErr w:type="spellStart"/>
-      <w:r>
-        <w:t>CustomUser</w:t>
-      </w:r>
-      <w:proofErr w:type="spellEnd"/>
-      <w:r>
-        <w:t xml:space="preserve"> at its core.</w:t>
+        <w:t xml:space="preserve"> running any migrations on Day 1, Django will cleanly build the database with your CustomUser at its core.</w:t>
       </w:r>
     </w:p>
     <w:p>
@@ -1629,15 +994,7 @@
     </w:p>
     <w:p>
       <w:r>
-        <w:t xml:space="preserve">python manage.py </w:t>
-      </w:r>
-      <w:proofErr w:type="spellStart"/>
-      <w:r>
-        <w:t>makemigrations</w:t>
-      </w:r>
-      <w:proofErr w:type="spellEnd"/>
-      <w:r>
-        <w:t xml:space="preserve"> users</w:t>
+        <w:t>python manage.py makemigrations users</w:t>
       </w:r>
     </w:p>
     <w:p>
@@ -1711,15 +1068,7 @@
     </w:p>
     <w:p>
       <w:r>
-        <w:t xml:space="preserve">git commit -m "feat: implement </w:t>
-      </w:r>
-      <w:proofErr w:type="spellStart"/>
-      <w:r>
-        <w:t>CustomUser</w:t>
-      </w:r>
-      <w:proofErr w:type="spellEnd"/>
-      <w:r>
-        <w:t xml:space="preserve"> model with student/instructor roles"</w:t>
+        <w:t>git commit -m "feat: implement CustomUser model with student/instructor roles"</w:t>
       </w:r>
     </w:p>
     <w:p>
@@ -1856,7 +1205,7 @@
     <w:p>
       <w:r>
         <w:pict w14:anchorId="3865E4D0">
-          <v:rect id="_x0000_i1036" style="width:0;height:1.5pt" o:hralign="center" o:hrstd="t" o:hr="t" fillcolor="#a0a0a0" stroked="f"/>
+          <v:rect id="_x0000_i1030" style="width:0;height:1.5pt" o:hralign="center" o:hrstd="t" o:hr="t" fillcolor="#a0a0a0" stroked="f"/>
         </w:pict>
       </w:r>
     </w:p>
@@ -1887,15 +1236,7 @@
         <w:t>never importing your Custom User model directly</w:t>
       </w:r>
       <w:r>
-        <w:t xml:space="preserve">. Always use </w:t>
-      </w:r>
-      <w:proofErr w:type="spellStart"/>
-      <w:r>
-        <w:t>settings.AUTH_USER_MODEL</w:t>
-      </w:r>
-      <w:proofErr w:type="spellEnd"/>
-      <w:r>
-        <w:t xml:space="preserve"> to define relationships, which prevents circular import errors.</w:t>
+        <w:t>. Always use settings.AUTH_USER_MODEL to define relationships, which prevents circular import errors.</w:t>
       </w:r>
     </w:p>
     <w:p>
@@ -1966,28 +1307,12 @@
     </w:p>
     <w:p>
       <w:r>
-        <w:t xml:space="preserve">python manage.py </w:t>
-      </w:r>
-      <w:proofErr w:type="spellStart"/>
-      <w:r>
-        <w:t>startapp</w:t>
-      </w:r>
-      <w:proofErr w:type="spellEnd"/>
-      <w:r>
-        <w:t xml:space="preserve"> courses</w:t>
-      </w:r>
-    </w:p>
-    <w:p>
-      <w:r>
-        <w:t xml:space="preserve">python manage.py </w:t>
-      </w:r>
-      <w:proofErr w:type="spellStart"/>
-      <w:r>
-        <w:t>startapp</w:t>
-      </w:r>
-      <w:proofErr w:type="spellEnd"/>
-      <w:r>
-        <w:t xml:space="preserve"> enrollments</w:t>
+        <w:t>python manage.py startapp courses</w:t>
+      </w:r>
+    </w:p>
+    <w:p>
+      <w:r>
+        <w:t>python manage.py startapp enrollments</w:t>
       </w:r>
     </w:p>
     <w:p>
@@ -2019,41 +1344,17 @@
     </w:p>
     <w:p>
       <w:r>
-        <w:t xml:space="preserve">    '</w:t>
-      </w:r>
-      <w:proofErr w:type="spellStart"/>
-      <w:r>
-        <w:t>users.apps.UsersConfig</w:t>
-      </w:r>
-      <w:proofErr w:type="spellEnd"/>
-      <w:r>
-        <w:t>',</w:t>
-      </w:r>
-    </w:p>
-    <w:p>
-      <w:r>
-        <w:t xml:space="preserve">    '</w:t>
-      </w:r>
-      <w:proofErr w:type="spellStart"/>
-      <w:r>
-        <w:t>courses.apps.CoursesConfig</w:t>
-      </w:r>
-      <w:proofErr w:type="spellEnd"/>
-      <w:r>
-        <w:t>',</w:t>
-      </w:r>
-    </w:p>
-    <w:p>
-      <w:r>
-        <w:t xml:space="preserve">    '</w:t>
-      </w:r>
-      <w:proofErr w:type="spellStart"/>
-      <w:r>
-        <w:t>enrollments.apps.EnrollmentsConfig</w:t>
-      </w:r>
-      <w:proofErr w:type="spellEnd"/>
-      <w:r>
-        <w:t>',</w:t>
+        <w:t xml:space="preserve">    'users.apps.UsersConfig',</w:t>
+      </w:r>
+    </w:p>
+    <w:p>
+      <w:r>
+        <w:t xml:space="preserve">    'courses.apps.CoursesConfig',</w:t>
+      </w:r>
+    </w:p>
+    <w:p>
+      <w:r>
+        <w:t xml:space="preserve">    'enrollments.apps.EnrollmentsConfig',</w:t>
       </w:r>
     </w:p>
     <w:p>
@@ -2077,127 +1378,39 @@
     </w:p>
     <w:p>
       <w:r>
-        <w:t xml:space="preserve">from </w:t>
-      </w:r>
-      <w:proofErr w:type="spellStart"/>
-      <w:r>
-        <w:t>django.db</w:t>
-      </w:r>
-      <w:proofErr w:type="spellEnd"/>
-      <w:r>
-        <w:t xml:space="preserve"> import models</w:t>
+        <w:t>from django.db import models</w:t>
       </w:r>
     </w:p>
     <w:p/>
     <w:p>
       <w:r>
-        <w:t>class Course(</w:t>
-      </w:r>
-      <w:proofErr w:type="spellStart"/>
-      <w:r>
-        <w:t>models.Model</w:t>
-      </w:r>
-      <w:proofErr w:type="spellEnd"/>
-      <w:r>
-        <w:t>):</w:t>
-      </w:r>
-    </w:p>
-    <w:p>
-      <w:r>
-        <w:t xml:space="preserve">    title = </w:t>
-      </w:r>
-      <w:proofErr w:type="spellStart"/>
-      <w:r>
-        <w:t>models.CharField</w:t>
-      </w:r>
-      <w:proofErr w:type="spellEnd"/>
-      <w:r>
-        <w:t>(</w:t>
-      </w:r>
-      <w:proofErr w:type="spellStart"/>
-      <w:r>
-        <w:t>max_length</w:t>
-      </w:r>
-      <w:proofErr w:type="spellEnd"/>
-      <w:r>
-        <w:t>=255)</w:t>
-      </w:r>
-    </w:p>
-    <w:p>
-      <w:r>
-        <w:t xml:space="preserve">    description = </w:t>
-      </w:r>
-      <w:proofErr w:type="spellStart"/>
-      <w:r>
-        <w:t>models.TextField</w:t>
-      </w:r>
-      <w:proofErr w:type="spellEnd"/>
-      <w:r>
-        <w:t>()</w:t>
+        <w:t>class Course(models.Model):</w:t>
+      </w:r>
+    </w:p>
+    <w:p>
+      <w:r>
+        <w:t xml:space="preserve">    title = models.CharField(max_length=255)</w:t>
+      </w:r>
+    </w:p>
+    <w:p>
+      <w:r>
+        <w:t xml:space="preserve">    description = models.TextField()</w:t>
       </w:r>
     </w:p>
     <w:p>
       <w:r>
         <w:lastRenderedPageBreak/>
-        <w:t xml:space="preserve">    capacity = </w:t>
-      </w:r>
-      <w:proofErr w:type="spellStart"/>
-      <w:r>
-        <w:t>models.PositiveIntegerField</w:t>
-      </w:r>
-      <w:proofErr w:type="spellEnd"/>
-      <w:r>
-        <w:t>(default=30)</w:t>
-      </w:r>
-    </w:p>
-    <w:p>
-      <w:r>
-        <w:t xml:space="preserve">    </w:t>
-      </w:r>
-      <w:proofErr w:type="spellStart"/>
-      <w:r>
-        <w:t>is_active</w:t>
-      </w:r>
-      <w:proofErr w:type="spellEnd"/>
-      <w:r>
-        <w:t xml:space="preserve"> = </w:t>
-      </w:r>
-      <w:proofErr w:type="spellStart"/>
-      <w:r>
-        <w:t>models.BooleanField</w:t>
-      </w:r>
-      <w:proofErr w:type="spellEnd"/>
-      <w:r>
-        <w:t>(default=True)</w:t>
-      </w:r>
-    </w:p>
-    <w:p>
-      <w:r>
-        <w:t xml:space="preserve">    </w:t>
-      </w:r>
-      <w:proofErr w:type="spellStart"/>
-      <w:r>
-        <w:t>created_at</w:t>
-      </w:r>
-      <w:proofErr w:type="spellEnd"/>
-      <w:r>
-        <w:t xml:space="preserve"> = </w:t>
-      </w:r>
-      <w:proofErr w:type="spellStart"/>
-      <w:r>
-        <w:t>models.DateTimeField</w:t>
-      </w:r>
-      <w:proofErr w:type="spellEnd"/>
-      <w:r>
-        <w:t>(</w:t>
-      </w:r>
-      <w:proofErr w:type="spellStart"/>
-      <w:r>
-        <w:t>auto_now_add</w:t>
-      </w:r>
-      <w:proofErr w:type="spellEnd"/>
-      <w:r>
-        <w:t>=True)</w:t>
+        <w:t xml:space="preserve">    capacity = models.PositiveIntegerField(default=30)</w:t>
+      </w:r>
+    </w:p>
+    <w:p>
+      <w:r>
+        <w:t xml:space="preserve">    is_active = models.BooleanField(default=True)</w:t>
+      </w:r>
+    </w:p>
+    <w:p>
+      <w:r>
+        <w:t xml:space="preserve">    created_at = models.DateTimeField(auto_now_add=True)</w:t>
       </w:r>
     </w:p>
     <w:p/>
@@ -2208,13 +1421,8 @@
     </w:p>
     <w:p>
       <w:r>
-        <w:t xml:space="preserve">        return </w:t>
-      </w:r>
-      <w:proofErr w:type="spellStart"/>
-      <w:r>
-        <w:t>self.title</w:t>
-      </w:r>
-      <w:proofErr w:type="spellEnd"/>
+        <w:t xml:space="preserve">        return self.title</w:t>
+      </w:r>
     </w:p>
     <w:p>
       <w:r>
@@ -2235,55 +1443,23 @@
     </w:p>
     <w:p>
       <w:r>
-        <w:t xml:space="preserve">from </w:t>
-      </w:r>
-      <w:proofErr w:type="spellStart"/>
-      <w:r>
-        <w:t>django.db</w:t>
-      </w:r>
-      <w:proofErr w:type="spellEnd"/>
-      <w:r>
-        <w:t xml:space="preserve"> import models</w:t>
-      </w:r>
-    </w:p>
-    <w:p>
-      <w:r>
-        <w:t xml:space="preserve">from </w:t>
-      </w:r>
-      <w:proofErr w:type="spellStart"/>
-      <w:r>
-        <w:t>django.conf</w:t>
-      </w:r>
-      <w:proofErr w:type="spellEnd"/>
-      <w:r>
-        <w:t xml:space="preserve"> import settings</w:t>
-      </w:r>
-    </w:p>
-    <w:p>
-      <w:r>
-        <w:t xml:space="preserve">from </w:t>
-      </w:r>
-      <w:proofErr w:type="spellStart"/>
-      <w:r>
-        <w:t>courses.models</w:t>
-      </w:r>
-      <w:proofErr w:type="spellEnd"/>
-      <w:r>
-        <w:t xml:space="preserve"> import Course</w:t>
+        <w:t>from django.db import models</w:t>
+      </w:r>
+    </w:p>
+    <w:p>
+      <w:r>
+        <w:t>from django.conf import settings</w:t>
+      </w:r>
+    </w:p>
+    <w:p>
+      <w:r>
+        <w:t>from courses.models import Course</w:t>
       </w:r>
     </w:p>
     <w:p/>
     <w:p>
       <w:r>
-        <w:t>class Enrollment(</w:t>
-      </w:r>
-      <w:proofErr w:type="spellStart"/>
-      <w:r>
-        <w:t>models.Model</w:t>
-      </w:r>
-      <w:proofErr w:type="spellEnd"/>
-      <w:r>
-        <w:t>):</w:t>
+        <w:t>class Enrollment(models.Model):</w:t>
       </w:r>
     </w:p>
     <w:p>
@@ -2319,134 +1495,22 @@
     </w:p>
     <w:p>
       <w:r>
-        <w:t xml:space="preserve">    student = </w:t>
-      </w:r>
-      <w:proofErr w:type="spellStart"/>
-      <w:r>
-        <w:t>models.ForeignKey</w:t>
-      </w:r>
-      <w:proofErr w:type="spellEnd"/>
-      <w:r>
-        <w:t>(</w:t>
-      </w:r>
-      <w:proofErr w:type="spellStart"/>
-      <w:r>
-        <w:t>settings.AUTH_USER_MODEL</w:t>
-      </w:r>
-      <w:proofErr w:type="spellEnd"/>
-      <w:r>
-        <w:t xml:space="preserve">, </w:t>
-      </w:r>
-      <w:proofErr w:type="spellStart"/>
-      <w:r>
-        <w:t>on_delete</w:t>
-      </w:r>
-      <w:proofErr w:type="spellEnd"/>
-      <w:r>
-        <w:t>=</w:t>
-      </w:r>
-      <w:proofErr w:type="spellStart"/>
-      <w:r>
-        <w:t>models.CASCADE</w:t>
-      </w:r>
-      <w:proofErr w:type="spellEnd"/>
-      <w:r>
-        <w:t xml:space="preserve">, </w:t>
-      </w:r>
-      <w:proofErr w:type="spellStart"/>
-      <w:r>
-        <w:t>related_name</w:t>
-      </w:r>
-      <w:proofErr w:type="spellEnd"/>
-      <w:r>
-        <w:t>='enrollments')</w:t>
-      </w:r>
-    </w:p>
-    <w:p>
-      <w:r>
-        <w:t xml:space="preserve">    course = </w:t>
-      </w:r>
-      <w:proofErr w:type="spellStart"/>
-      <w:r>
-        <w:t>models.ForeignKey</w:t>
-      </w:r>
-      <w:proofErr w:type="spellEnd"/>
-      <w:r>
-        <w:t xml:space="preserve">(Course, </w:t>
-      </w:r>
-      <w:proofErr w:type="spellStart"/>
-      <w:r>
-        <w:t>on_delete</w:t>
-      </w:r>
-      <w:proofErr w:type="spellEnd"/>
-      <w:r>
-        <w:t>=</w:t>
-      </w:r>
-      <w:proofErr w:type="spellStart"/>
-      <w:r>
-        <w:t>models.CASCADE</w:t>
-      </w:r>
-      <w:proofErr w:type="spellEnd"/>
-      <w:r>
-        <w:t xml:space="preserve">, </w:t>
-      </w:r>
-      <w:proofErr w:type="spellStart"/>
-      <w:r>
-        <w:t>related_name</w:t>
-      </w:r>
-      <w:proofErr w:type="spellEnd"/>
-      <w:r>
-        <w:t>='enrollments')</w:t>
-      </w:r>
-    </w:p>
-    <w:p>
-      <w:r>
-        <w:t xml:space="preserve">    status = </w:t>
-      </w:r>
-      <w:proofErr w:type="spellStart"/>
-      <w:r>
-        <w:t>models.CharField</w:t>
-      </w:r>
-      <w:proofErr w:type="spellEnd"/>
-      <w:r>
-        <w:t>(</w:t>
-      </w:r>
-      <w:proofErr w:type="spellStart"/>
-      <w:r>
-        <w:t>max_length</w:t>
-      </w:r>
-      <w:proofErr w:type="spellEnd"/>
-      <w:r>
-        <w:t>=20, choices=STATUS_CHOICES, default='active')</w:t>
-      </w:r>
-    </w:p>
-    <w:p>
-      <w:r>
-        <w:t xml:space="preserve">    </w:t>
-      </w:r>
-      <w:proofErr w:type="spellStart"/>
-      <w:r>
-        <w:t>enrollment_date</w:t>
-      </w:r>
-      <w:proofErr w:type="spellEnd"/>
-      <w:r>
-        <w:t xml:space="preserve"> = </w:t>
-      </w:r>
-      <w:proofErr w:type="spellStart"/>
-      <w:r>
-        <w:t>models.DateTimeField</w:t>
-      </w:r>
-      <w:proofErr w:type="spellEnd"/>
-      <w:r>
-        <w:t>(</w:t>
-      </w:r>
-      <w:proofErr w:type="spellStart"/>
-      <w:r>
-        <w:t>auto_now_add</w:t>
-      </w:r>
-      <w:proofErr w:type="spellEnd"/>
-      <w:r>
-        <w:t>=True)</w:t>
+        <w:t xml:space="preserve">    student = models.ForeignKey(settings.AUTH_USER_MODEL, on_delete=models.CASCADE, related_name='enrollments')</w:t>
+      </w:r>
+    </w:p>
+    <w:p>
+      <w:r>
+        <w:t xml:space="preserve">    course = models.ForeignKey(Course, on_delete=models.CASCADE, related_name='enrollments')</w:t>
+      </w:r>
+    </w:p>
+    <w:p>
+      <w:r>
+        <w:t xml:space="preserve">    status = models.CharField(max_length=20, choices=STATUS_CHOICES, default='active')</w:t>
+      </w:r>
+    </w:p>
+    <w:p>
+      <w:r>
+        <w:t xml:space="preserve">    enrollment_date = models.DateTimeField(auto_now_add=True)</w:t>
       </w:r>
     </w:p>
     <w:p/>
@@ -2462,15 +1526,7 @@
     </w:p>
     <w:p>
       <w:r>
-        <w:t xml:space="preserve">        </w:t>
-      </w:r>
-      <w:proofErr w:type="spellStart"/>
-      <w:r>
-        <w:t>unique_together</w:t>
-      </w:r>
-      <w:proofErr w:type="spellEnd"/>
-      <w:r>
-        <w:t xml:space="preserve"> = ('student', 'course')</w:t>
+        <w:t xml:space="preserve">        unique_together = ('student', 'course')</w:t>
       </w:r>
     </w:p>
     <w:p/>
@@ -2481,23 +1537,7 @@
     </w:p>
     <w:p>
       <w:r>
-        <w:t xml:space="preserve">        return f"{</w:t>
-      </w:r>
-      <w:proofErr w:type="spellStart"/>
-      <w:r>
-        <w:t>self.student.username</w:t>
-      </w:r>
-      <w:proofErr w:type="spellEnd"/>
-      <w:r>
-        <w:t>} - {</w:t>
-      </w:r>
-      <w:proofErr w:type="spellStart"/>
-      <w:r>
-        <w:t>self.course.title</w:t>
-      </w:r>
-      <w:proofErr w:type="spellEnd"/>
-      <w:r>
-        <w:t>}"</w:t>
+        <w:t xml:space="preserve">        return f"{self.student.username} - {self.course.title}"</w:t>
       </w:r>
     </w:p>
     <w:p>
@@ -2527,13 +1567,8 @@
     </w:p>
     <w:p>
       <w:r>
-        <w:t xml:space="preserve">python manage.py </w:t>
-      </w:r>
-      <w:proofErr w:type="spellStart"/>
-      <w:r>
-        <w:t>makemigrations</w:t>
-      </w:r>
-      <w:proofErr w:type="spellEnd"/>
+        <w:t>python manage.py makemigrations</w:t>
+      </w:r>
     </w:p>
     <w:p>
       <w:r>
@@ -2748,6 +1783,1252 @@
         <w:t>git branch -d feature/auth-system</w:t>
       </w:r>
     </w:p>
+    <w:p/>
+    <w:p>
+      <w:r>
+        <w:t xml:space="preserve">To make this frontend fully functional, we need to connect the three critical points of the Django MVT architecture: </w:t>
+      </w:r>
+      <w:r>
+        <w:rPr>
+          <w:b/>
+          <w:bCs/>
+        </w:rPr>
+        <w:t>URLs (Routing)</w:t>
+      </w:r>
+      <w:r>
+        <w:t xml:space="preserve">, </w:t>
+      </w:r>
+      <w:r>
+        <w:rPr>
+          <w:b/>
+          <w:bCs/>
+        </w:rPr>
+        <w:t>Views (Logic)</w:t>
+      </w:r>
+      <w:r>
+        <w:t xml:space="preserve">, and </w:t>
+      </w:r>
+      <w:r>
+        <w:rPr>
+          <w:b/>
+          <w:bCs/>
+        </w:rPr>
+        <w:t>Templates (UI)</w:t>
+      </w:r>
+      <w:r>
+        <w:t>.</w:t>
+      </w:r>
+    </w:p>
+    <w:p>
+      <w:r>
+        <w:t xml:space="preserve">Since we are treating this as an Agile production sprint, we will use </w:t>
+      </w:r>
+      <w:r>
+        <w:rPr>
+          <w:b/>
+          <w:bCs/>
+        </w:rPr>
+        <w:t>Bootstrap 5 via CDN</w:t>
+      </w:r>
+      <w:r>
+        <w:t xml:space="preserve"> in our base template. This allows the squad to build a clean, responsive, professional UI immediately without writing hundreds of lines of custom CSS.</w:t>
+      </w:r>
+    </w:p>
+    <w:p>
+      <w:r>
+        <w:t>Here is the complete code architecture for your core views and templates.</w:t>
+      </w:r>
+    </w:p>
+    <w:p>
+      <w:r>
+        <w:pict w14:anchorId="3A2F4420">
+          <v:rect id="_x0000_i1049" style="width:0;height:1.5pt" o:hralign="center" o:hrstd="t" o:hr="t" fillcolor="#a0a0a0" stroked="f"/>
+        </w:pict>
+      </w:r>
+    </w:p>
+    <w:p>
+      <w:pPr>
+        <w:rPr>
+          <w:b/>
+          <w:bCs/>
+        </w:rPr>
+      </w:pPr>
+      <w:r>
+        <w:rPr>
+          <w:b/>
+          <w:bCs/>
+        </w:rPr>
+        <w:t>Phase 1: Global Routing &amp; Base Template</w:t>
+      </w:r>
+    </w:p>
+    <w:p>
+      <w:r>
+        <w:t>First, tell your main project to route traffic to your apps.</w:t>
+      </w:r>
+    </w:p>
+    <w:p>
+      <w:r>
+        <w:rPr>
+          <w:b/>
+          <w:bCs/>
+        </w:rPr>
+        <w:t>1. config/urls.py (Main Project Router)</w:t>
+      </w:r>
+    </w:p>
+    <w:p>
+      <w:r>
+        <w:t>Python</w:t>
+      </w:r>
+    </w:p>
+    <w:p>
+      <w:r>
+        <w:t>from django.contrib import admin</w:t>
+      </w:r>
+    </w:p>
+    <w:p>
+      <w:r>
+        <w:t>from django.urls import path, include</w:t>
+      </w:r>
+    </w:p>
+    <w:p>
+      <w:r>
+        <w:t>from django.views.generic import RedirectView</w:t>
+      </w:r>
+    </w:p>
+    <w:p/>
+    <w:p>
+      <w:r>
+        <w:t>urlpatterns = [</w:t>
+      </w:r>
+    </w:p>
+    <w:p>
+      <w:r>
+        <w:t xml:space="preserve">    path('admin/', admin.site.urls),</w:t>
+      </w:r>
+    </w:p>
+    <w:p>
+      <w:r>
+        <w:t xml:space="preserve">    # Route empty URL to courses catalog automatically</w:t>
+      </w:r>
+    </w:p>
+    <w:p>
+      <w:r>
+        <w:t xml:space="preserve">    path('', RedirectView.as_view(pattern_name='courses:list', permanent=False)),</w:t>
+      </w:r>
+    </w:p>
+    <w:p>
+      <w:r>
+        <w:t xml:space="preserve">    path('courses/', include('courses.urls')),</w:t>
+      </w:r>
+    </w:p>
+    <w:p>
+      <w:r>
+        <w:lastRenderedPageBreak/>
+        <w:t xml:space="preserve">    path('enrollments/', include('enrollments.urls')),</w:t>
+      </w:r>
+    </w:p>
+    <w:p>
+      <w:r>
+        <w:t>]</w:t>
+      </w:r>
+    </w:p>
+    <w:p>
+      <w:r>
+        <w:rPr>
+          <w:b/>
+          <w:bCs/>
+        </w:rPr>
+        <w:t>2. templates/base.html (The Global UI Wrapper)</w:t>
+      </w:r>
+      <w:r>
+        <w:t xml:space="preserve"> This file lives in the root templates folder you created in config/settings.py. It handles the navbar, Bootstrap styling, and system messages (like "Enrollment Successful").</w:t>
+      </w:r>
+    </w:p>
+    <w:p>
+      <w:r>
+        <w:t>HTML</w:t>
+      </w:r>
+    </w:p>
+    <w:p>
+      <w:r>
+        <w:t>&lt;!DOCTYPE html&gt;</w:t>
+      </w:r>
+    </w:p>
+    <w:p>
+      <w:r>
+        <w:t>&lt;html lang="en"&gt;</w:t>
+      </w:r>
+    </w:p>
+    <w:p>
+      <w:r>
+        <w:t>&lt;head&gt;</w:t>
+      </w:r>
+    </w:p>
+    <w:p>
+      <w:r>
+        <w:t xml:space="preserve">    &lt;meta charset="UTF-8"&gt;</w:t>
+      </w:r>
+    </w:p>
+    <w:p>
+      <w:r>
+        <w:t xml:space="preserve">    &lt;meta name="viewport" content="width=device-width, initial-scale=1.0"&gt;</w:t>
+      </w:r>
+    </w:p>
+    <w:p>
+      <w:r>
+        <w:t xml:space="preserve">    &lt;title&gt;EduSys Platform&lt;/title&gt;</w:t>
+      </w:r>
+    </w:p>
+    <w:p>
+      <w:r>
+        <w:t xml:space="preserve">    &lt;link href="https://cdn.jsdelivr.net/npm/bootstrap@5.3.0/dist/css/bootstrap.min.css" rel="stylesheet"&gt;</w:t>
+      </w:r>
+    </w:p>
+    <w:p>
+      <w:r>
+        <w:t>&lt;/head&gt;</w:t>
+      </w:r>
+    </w:p>
+    <w:p>
+      <w:r>
+        <w:t>&lt;body class="bg-light"&gt;</w:t>
+      </w:r>
+    </w:p>
+    <w:p/>
+    <w:p>
+      <w:r>
+        <w:t xml:space="preserve">    &lt;nav class="navbar navbar-expand-lg navbar-dark bg-dark mb-4"&gt;</w:t>
+      </w:r>
+    </w:p>
+    <w:p>
+      <w:r>
+        <w:t xml:space="preserve">        &lt;div class="container"&gt;</w:t>
+      </w:r>
+    </w:p>
+    <w:p>
+      <w:r>
+        <w:t xml:space="preserve">            &lt;a class="navbar-brand" href="/"&gt;EduSys Platform&lt;/a&gt;</w:t>
+      </w:r>
+    </w:p>
+    <w:p>
+      <w:r>
+        <w:t xml:space="preserve">            &lt;div class="navbar-nav ms-auto"&gt;</w:t>
+      </w:r>
+    </w:p>
+    <w:p>
+      <w:r>
+        <w:t xml:space="preserve">                &lt;a class="nav-link" href="/courses/"&gt;Course Catalog&lt;/a&gt;</w:t>
+      </w:r>
+    </w:p>
+    <w:p>
+      <w:r>
+        <w:t xml:space="preserve">                {% if user.is_authenticated %}</w:t>
+      </w:r>
+    </w:p>
+    <w:p>
+      <w:r>
+        <w:t xml:space="preserve">                    &lt;span class="nav-link text-warning"&gt;Welcome, {{ user.username }}&lt;/span&gt;</w:t>
+      </w:r>
+    </w:p>
+    <w:p>
+      <w:r>
+        <w:t xml:space="preserve">                {% else %}</w:t>
+      </w:r>
+    </w:p>
+    <w:p>
+      <w:r>
+        <w:t xml:space="preserve">                    &lt;a class="nav-link" href="/admin/"&gt;Login&lt;/a&gt;</w:t>
+      </w:r>
+    </w:p>
+    <w:p>
+      <w:r>
+        <w:t xml:space="preserve">                {% endif %}</w:t>
+      </w:r>
+    </w:p>
+    <w:p>
+      <w:r>
+        <w:lastRenderedPageBreak/>
+        <w:t xml:space="preserve">            &lt;/div&gt;</w:t>
+      </w:r>
+    </w:p>
+    <w:p>
+      <w:r>
+        <w:t xml:space="preserve">        &lt;/div&gt;</w:t>
+      </w:r>
+    </w:p>
+    <w:p>
+      <w:r>
+        <w:t xml:space="preserve">    &lt;/nav&gt;</w:t>
+      </w:r>
+    </w:p>
+    <w:p/>
+    <w:p>
+      <w:r>
+        <w:t xml:space="preserve">    &lt;main class="container"&gt;</w:t>
+      </w:r>
+    </w:p>
+    <w:p>
+      <w:r>
+        <w:t xml:space="preserve">        {% if messages %}</w:t>
+      </w:r>
+    </w:p>
+    <w:p>
+      <w:r>
+        <w:t xml:space="preserve">            {% for message in messages %}</w:t>
+      </w:r>
+    </w:p>
+    <w:p>
+      <w:r>
+        <w:t xml:space="preserve">                &lt;div class="alert alert-{{ message.tags }} alert-dismissible fade show" role="alert"&gt;</w:t>
+      </w:r>
+    </w:p>
+    <w:p>
+      <w:r>
+        <w:t xml:space="preserve">                    {{ message }}</w:t>
+      </w:r>
+    </w:p>
+    <w:p>
+      <w:r>
+        <w:t xml:space="preserve">                    &lt;button type="button" class="btn-close" data-bs-dismiss="alert"&gt;&lt;/button&gt;</w:t>
+      </w:r>
+    </w:p>
+    <w:p>
+      <w:r>
+        <w:t xml:space="preserve">                &lt;/div&gt;</w:t>
+      </w:r>
+    </w:p>
+    <w:p>
+      <w:r>
+        <w:t xml:space="preserve">            {% endfor %}</w:t>
+      </w:r>
+    </w:p>
+    <w:p>
+      <w:r>
+        <w:t xml:space="preserve">        {% endif %}</w:t>
+      </w:r>
+    </w:p>
+    <w:p/>
+    <w:p>
+      <w:r>
+        <w:t xml:space="preserve">        {% block content %}</w:t>
+      </w:r>
+    </w:p>
+    <w:p>
+      <w:r>
+        <w:t xml:space="preserve">        {% endblock content %}</w:t>
+      </w:r>
+    </w:p>
+    <w:p>
+      <w:r>
+        <w:t xml:space="preserve">    &lt;/main&gt;</w:t>
+      </w:r>
+    </w:p>
+    <w:p/>
+    <w:p>
+      <w:r>
+        <w:t xml:space="preserve">    &lt;script src="https://cdn.jsdelivr.net/npm/bootstrap@5.3.0/dist/js/bootstrap.bundle.min.js"&gt;&lt;/script&gt;</w:t>
+      </w:r>
+    </w:p>
+    <w:p>
+      <w:r>
+        <w:t>&lt;/body&gt;</w:t>
+      </w:r>
+    </w:p>
+    <w:p>
+      <w:r>
+        <w:t>&lt;/html&gt;</w:t>
+      </w:r>
+    </w:p>
+    <w:p>
+      <w:r>
+        <w:pict w14:anchorId="425544B6">
+          <v:rect id="_x0000_i1050" style="width:0;height:1.5pt" o:hralign="center" o:hrstd="t" o:hr="t" fillcolor="#a0a0a0" stroked="f"/>
+        </w:pict>
+      </w:r>
+    </w:p>
+    <w:p>
+      <w:pPr>
+        <w:rPr>
+          <w:b/>
+          <w:bCs/>
+        </w:rPr>
+      </w:pPr>
+      <w:r>
+        <w:rPr>
+          <w:b/>
+          <w:bCs/>
+        </w:rPr>
+        <w:t>Phase 2: The Courses Domain</w:t>
+      </w:r>
+    </w:p>
+    <w:p>
+      <w:r>
+        <w:rPr>
+          <w:b/>
+          <w:bCs/>
+        </w:rPr>
+        <w:t>1. courses/urls.py</w:t>
+      </w:r>
+      <w:r>
+        <w:t xml:space="preserve"> Create this file to handle course-specific routing.</w:t>
+      </w:r>
+    </w:p>
+    <w:p>
+      <w:r>
+        <w:t>Python</w:t>
+      </w:r>
+    </w:p>
+    <w:p>
+      <w:r>
+        <w:lastRenderedPageBreak/>
+        <w:t>from django.urls import path</w:t>
+      </w:r>
+    </w:p>
+    <w:p>
+      <w:r>
+        <w:t>from . import views</w:t>
+      </w:r>
+    </w:p>
+    <w:p/>
+    <w:p>
+      <w:r>
+        <w:t>app_name = 'courses' # Namespace for clean reverse URLs</w:t>
+      </w:r>
+    </w:p>
+    <w:p/>
+    <w:p>
+      <w:r>
+        <w:t>urlpatterns = [</w:t>
+      </w:r>
+    </w:p>
+    <w:p>
+      <w:r>
+        <w:t xml:space="preserve">    path('', views.CourseListView.as_view(), name='list'),</w:t>
+      </w:r>
+    </w:p>
+    <w:p>
+      <w:r>
+        <w:t xml:space="preserve">    path('&lt;int:pk&gt;/', views.CourseDetailView.as_view(), name='detail'),</w:t>
+      </w:r>
+    </w:p>
+    <w:p>
+      <w:r>
+        <w:t>]</w:t>
+      </w:r>
+    </w:p>
+    <w:p>
+      <w:r>
+        <w:rPr>
+          <w:b/>
+          <w:bCs/>
+        </w:rPr>
+        <w:t>2. courses/views.py</w:t>
+      </w:r>
+      <w:r>
+        <w:t xml:space="preserve"> We will implement a ListView for the catalog and a DetailView to see specific course info.</w:t>
+      </w:r>
+    </w:p>
+    <w:p>
+      <w:r>
+        <w:t>Python</w:t>
+      </w:r>
+    </w:p>
+    <w:p>
+      <w:r>
+        <w:t>from django.views.generic import ListView, DetailView</w:t>
+      </w:r>
+    </w:p>
+    <w:p>
+      <w:r>
+        <w:t>from .models import Course</w:t>
+      </w:r>
+    </w:p>
+    <w:p/>
+    <w:p>
+      <w:r>
+        <w:t>class CourseListView(ListView):</w:t>
+      </w:r>
+    </w:p>
+    <w:p>
+      <w:r>
+        <w:t xml:space="preserve">    model = Course</w:t>
+      </w:r>
+    </w:p>
+    <w:p>
+      <w:r>
+        <w:t xml:space="preserve">    template_name = 'courses/course_list.html'</w:t>
+      </w:r>
+    </w:p>
+    <w:p>
+      <w:r>
+        <w:t xml:space="preserve">    context_object_name = 'courses'</w:t>
+      </w:r>
+    </w:p>
+    <w:p>
+      <w:r>
+        <w:t xml:space="preserve">    </w:t>
+      </w:r>
+    </w:p>
+    <w:p>
+      <w:r>
+        <w:t xml:space="preserve">    def get_queryset(self):</w:t>
+      </w:r>
+    </w:p>
+    <w:p>
+      <w:r>
+        <w:t xml:space="preserve">        # Only display active courses to students</w:t>
+      </w:r>
+    </w:p>
+    <w:p>
+      <w:r>
+        <w:t xml:space="preserve">        return Course.objects.filter(is_active=True).order_by('-created_at')</w:t>
+      </w:r>
+    </w:p>
+    <w:p/>
+    <w:p>
+      <w:r>
+        <w:t>class CourseDetailView(DetailView):</w:t>
+      </w:r>
+    </w:p>
+    <w:p>
+      <w:r>
+        <w:t xml:space="preserve">    model = Course</w:t>
+      </w:r>
+    </w:p>
+    <w:p>
+      <w:r>
+        <w:lastRenderedPageBreak/>
+        <w:t xml:space="preserve">    template_name = 'courses/course_detail.html'</w:t>
+      </w:r>
+    </w:p>
+    <w:p>
+      <w:r>
+        <w:t xml:space="preserve">    context_object_name = 'course'</w:t>
+      </w:r>
+    </w:p>
+    <w:p>
+      <w:r>
+        <w:rPr>
+          <w:b/>
+          <w:bCs/>
+        </w:rPr>
+        <w:t>3. courses/templates/courses/course_list.html</w:t>
+      </w:r>
+      <w:r>
+        <w:t xml:space="preserve"> Create the nested folders inside your app.</w:t>
+      </w:r>
+    </w:p>
+    <w:p>
+      <w:r>
+        <w:t>HTML</w:t>
+      </w:r>
+    </w:p>
+    <w:p>
+      <w:r>
+        <w:t>{% extends 'base.html' %}</w:t>
+      </w:r>
+    </w:p>
+    <w:p/>
+    <w:p>
+      <w:r>
+        <w:t>{% block content %}</w:t>
+      </w:r>
+    </w:p>
+    <w:p>
+      <w:r>
+        <w:t>&lt;div class="row"&gt;</w:t>
+      </w:r>
+    </w:p>
+    <w:p>
+      <w:r>
+        <w:t xml:space="preserve">    &lt;div class="col-12 mb-4"&gt;</w:t>
+      </w:r>
+    </w:p>
+    <w:p>
+      <w:r>
+        <w:t xml:space="preserve">        &lt;h2&gt;Available Courses&lt;/h2&gt;</w:t>
+      </w:r>
+    </w:p>
+    <w:p>
+      <w:r>
+        <w:t xml:space="preserve">        &lt;hr&gt;</w:t>
+      </w:r>
+    </w:p>
+    <w:p>
+      <w:r>
+        <w:t xml:space="preserve">    &lt;/div&gt;</w:t>
+      </w:r>
+    </w:p>
+    <w:p>
+      <w:r>
+        <w:t xml:space="preserve">    </w:t>
+      </w:r>
+    </w:p>
+    <w:p>
+      <w:r>
+        <w:t xml:space="preserve">    {% for course in courses %}</w:t>
+      </w:r>
+    </w:p>
+    <w:p>
+      <w:r>
+        <w:t xml:space="preserve">    &lt;div class="col-md-4 mb-4"&gt;</w:t>
+      </w:r>
+    </w:p>
+    <w:p>
+      <w:r>
+        <w:t xml:space="preserve">        &lt;div class="card h-100 shadow-sm"&gt;</w:t>
+      </w:r>
+    </w:p>
+    <w:p>
+      <w:r>
+        <w:t xml:space="preserve">            &lt;div class="card-body"&gt;</w:t>
+      </w:r>
+    </w:p>
+    <w:p>
+      <w:r>
+        <w:t xml:space="preserve">                &lt;h5 class="card-title"&gt;{{ course.title }}&lt;/h5&gt;</w:t>
+      </w:r>
+    </w:p>
+    <w:p>
+      <w:r>
+        <w:t xml:space="preserve">                &lt;p class="card-text text-muted"&gt;{{ course.description|truncatewords:15 }}&lt;/p&gt;</w:t>
+      </w:r>
+    </w:p>
+    <w:p>
+      <w:r>
+        <w:t xml:space="preserve">                &lt;p class="mb-2"&gt;&lt;strong&gt;Capacity:&lt;/strong&gt; {{ course.capacity }} students&lt;/p&gt;</w:t>
+      </w:r>
+    </w:p>
+    <w:p>
+      <w:r>
+        <w:t xml:space="preserve">            &lt;/div&gt;</w:t>
+      </w:r>
+    </w:p>
+    <w:p>
+      <w:r>
+        <w:t xml:space="preserve">            &lt;div class="card-footer bg-white border-top-0"&gt;</w:t>
+      </w:r>
+    </w:p>
+    <w:p>
+      <w:r>
+        <w:t xml:space="preserve">                &lt;a href="{% url 'courses:detail' course.id %}" class="btn btn-outline-primary w-100"&gt;View Details&lt;/a&gt;</w:t>
+      </w:r>
+    </w:p>
+    <w:p>
+      <w:r>
+        <w:t xml:space="preserve">            &lt;/div&gt;</w:t>
+      </w:r>
+    </w:p>
+    <w:p>
+      <w:r>
+        <w:t xml:space="preserve">        &lt;/div&gt;</w:t>
+      </w:r>
+    </w:p>
+    <w:p>
+      <w:r>
+        <w:lastRenderedPageBreak/>
+        <w:t xml:space="preserve">    &lt;/div&gt;</w:t>
+      </w:r>
+    </w:p>
+    <w:p>
+      <w:r>
+        <w:t xml:space="preserve">    {% empty %}</w:t>
+      </w:r>
+    </w:p>
+    <w:p>
+      <w:r>
+        <w:t xml:space="preserve">    &lt;div class="col-12"&gt;</w:t>
+      </w:r>
+    </w:p>
+    <w:p>
+      <w:r>
+        <w:t xml:space="preserve">        &lt;div class="alert alert-info"&gt;No courses are currently available.&lt;/div&gt;</w:t>
+      </w:r>
+    </w:p>
+    <w:p>
+      <w:r>
+        <w:t xml:space="preserve">    &lt;/div&gt;</w:t>
+      </w:r>
+    </w:p>
+    <w:p>
+      <w:r>
+        <w:t xml:space="preserve">    {% endfor %}</w:t>
+      </w:r>
+    </w:p>
+    <w:p>
+      <w:r>
+        <w:t>&lt;/div&gt;</w:t>
+      </w:r>
+    </w:p>
+    <w:p>
+      <w:r>
+        <w:t>{% endblock %}</w:t>
+      </w:r>
+    </w:p>
+    <w:p>
+      <w:r>
+        <w:rPr>
+          <w:b/>
+          <w:bCs/>
+        </w:rPr>
+        <w:t>4. courses/templates/courses/course_detail.html</w:t>
+      </w:r>
+    </w:p>
+    <w:p>
+      <w:r>
+        <w:t>HTML</w:t>
+      </w:r>
+    </w:p>
+    <w:p>
+      <w:r>
+        <w:t>{% extends 'base.html' %}</w:t>
+      </w:r>
+    </w:p>
+    <w:p/>
+    <w:p>
+      <w:r>
+        <w:t>{% block content %}</w:t>
+      </w:r>
+    </w:p>
+    <w:p>
+      <w:r>
+        <w:t>&lt;div class="row justify-content-center"&gt;</w:t>
+      </w:r>
+    </w:p>
+    <w:p>
+      <w:r>
+        <w:t xml:space="preserve">    &lt;div class="col-md-8"&gt;</w:t>
+      </w:r>
+    </w:p>
+    <w:p>
+      <w:r>
+        <w:t xml:space="preserve">        &lt;div class="card shadow"&gt;</w:t>
+      </w:r>
+    </w:p>
+    <w:p>
+      <w:r>
+        <w:t xml:space="preserve">            &lt;div class="card-header bg-primary text-white"&gt;</w:t>
+      </w:r>
+    </w:p>
+    <w:p>
+      <w:r>
+        <w:t xml:space="preserve">                &lt;h3 class="mb-0"&gt;{{ course.title }}&lt;/h3&gt;</w:t>
+      </w:r>
+    </w:p>
+    <w:p>
+      <w:r>
+        <w:t xml:space="preserve">            &lt;/div&gt;</w:t>
+      </w:r>
+    </w:p>
+    <w:p>
+      <w:r>
+        <w:t xml:space="preserve">            &lt;div class="card-body"&gt;</w:t>
+      </w:r>
+    </w:p>
+    <w:p>
+      <w:r>
+        <w:t xml:space="preserve">                &lt;h4&gt;Course Description&lt;/h4&gt;</w:t>
+      </w:r>
+    </w:p>
+    <w:p>
+      <w:r>
+        <w:t xml:space="preserve">                &lt;p&gt;{{ course.description }}&lt;/p&gt;</w:t>
+      </w:r>
+    </w:p>
+    <w:p>
+      <w:r>
+        <w:t xml:space="preserve">                </w:t>
+      </w:r>
+    </w:p>
+    <w:p>
+      <w:r>
+        <w:t xml:space="preserve">                &lt;hr&gt;</w:t>
+      </w:r>
+    </w:p>
+    <w:p>
+      <w:r>
+        <w:t xml:space="preserve">                &lt;p&gt;&lt;strong&gt;Maximum Capacity:&lt;/strong&gt; {{ course.capacity }}&lt;/p&gt;</w:t>
+      </w:r>
+    </w:p>
+    <w:p>
+      <w:r>
+        <w:lastRenderedPageBreak/>
+        <w:t xml:space="preserve">                </w:t>
+      </w:r>
+    </w:p>
+    <w:p>
+      <w:r>
+        <w:t xml:space="preserve">                &lt;a href="{% url 'enrollments:enroll' course.id %}" class="btn btn-success btn-lg mt-3"&gt;</w:t>
+      </w:r>
+    </w:p>
+    <w:p>
+      <w:r>
+        <w:t xml:space="preserve">                    Enroll in this Course</w:t>
+      </w:r>
+    </w:p>
+    <w:p>
+      <w:r>
+        <w:t xml:space="preserve">                &lt;/a&gt;</w:t>
+      </w:r>
+    </w:p>
+    <w:p>
+      <w:r>
+        <w:t xml:space="preserve">                &lt;a href="{% url 'courses:list' %}" class="btn btn-secondary btn-lg mt-3 ms-2"&gt;</w:t>
+      </w:r>
+    </w:p>
+    <w:p>
+      <w:r>
+        <w:t xml:space="preserve">                    Back to Catalog</w:t>
+      </w:r>
+    </w:p>
+    <w:p>
+      <w:r>
+        <w:t xml:space="preserve">                &lt;/a&gt;</w:t>
+      </w:r>
+    </w:p>
+    <w:p>
+      <w:r>
+        <w:t xml:space="preserve">            &lt;/div&gt;</w:t>
+      </w:r>
+    </w:p>
+    <w:p>
+      <w:r>
+        <w:t xml:space="preserve">        &lt;/div&gt;</w:t>
+      </w:r>
+    </w:p>
+    <w:p>
+      <w:r>
+        <w:t xml:space="preserve">    &lt;/div&gt;</w:t>
+      </w:r>
+    </w:p>
+    <w:p>
+      <w:r>
+        <w:t>&lt;/div&gt;</w:t>
+      </w:r>
+    </w:p>
+    <w:p>
+      <w:r>
+        <w:t>{% endblock %}</w:t>
+      </w:r>
+    </w:p>
+    <w:p>
+      <w:r>
+        <w:pict w14:anchorId="5C39D6BA">
+          <v:rect id="_x0000_i1051" style="width:0;height:1.5pt" o:hralign="center" o:hrstd="t" o:hr="t" fillcolor="#a0a0a0" stroked="f"/>
+        </w:pict>
+      </w:r>
+    </w:p>
+    <w:p>
+      <w:pPr>
+        <w:rPr>
+          <w:b/>
+          <w:bCs/>
+        </w:rPr>
+      </w:pPr>
+      <w:r>
+        <w:rPr>
+          <w:b/>
+          <w:bCs/>
+        </w:rPr>
+        <w:t>Phase 3: The Enrollments Domain</w:t>
+      </w:r>
+    </w:p>
+    <w:p>
+      <w:r>
+        <w:rPr>
+          <w:b/>
+          <w:bCs/>
+        </w:rPr>
+        <w:t>1. enrollments/urls.py</w:t>
+      </w:r>
+    </w:p>
+    <w:p>
+      <w:r>
+        <w:t>Python</w:t>
+      </w:r>
+    </w:p>
+    <w:p>
+      <w:r>
+        <w:t>from django.urls import path</w:t>
+      </w:r>
+    </w:p>
+    <w:p>
+      <w:r>
+        <w:t>from . import views</w:t>
+      </w:r>
+    </w:p>
+    <w:p/>
+    <w:p>
+      <w:r>
+        <w:t>app_name = 'enrollments'</w:t>
+      </w:r>
+    </w:p>
+    <w:p/>
+    <w:p>
+      <w:r>
+        <w:t>urlpatterns = [</w:t>
+      </w:r>
+    </w:p>
+    <w:p>
+      <w:r>
+        <w:t xml:space="preserve">    # Pass the course_id through the URL so the view knows what the user is enrolling in</w:t>
+      </w:r>
+    </w:p>
+    <w:p>
+      <w:r>
+        <w:t xml:space="preserve">    path('enroll/&lt;int:course_id&gt;/', views.EnrollmentCreateView.as_view(), name='enroll'),</w:t>
+      </w:r>
+    </w:p>
+    <w:p>
+      <w:r>
+        <w:t>]</w:t>
+      </w:r>
+    </w:p>
+    <w:p>
+      <w:r>
+        <w:rPr>
+          <w:b/>
+          <w:bCs/>
+        </w:rPr>
+        <w:lastRenderedPageBreak/>
+        <w:t>2. enrollments/views.py</w:t>
+      </w:r>
+      <w:r>
+        <w:t xml:space="preserve"> This uses the strict, atomic transaction logic to prevent race conditions when multiple students click enroll at the exact same millisecond.</w:t>
+      </w:r>
+    </w:p>
+    <w:p>
+      <w:r>
+        <w:t>Python</w:t>
+      </w:r>
+    </w:p>
+    <w:p>
+      <w:r>
+        <w:t>from django.shortcuts import get_object_or_404, redirect</w:t>
+      </w:r>
+    </w:p>
+    <w:p>
+      <w:r>
+        <w:t>from django.urls import reverse_lazy</w:t>
+      </w:r>
+    </w:p>
+    <w:p>
+      <w:r>
+        <w:t>from django.views.generic import CreateView</w:t>
+      </w:r>
+    </w:p>
+    <w:p>
+      <w:r>
+        <w:t>from django.contrib.auth.mixins import LoginRequiredMixin</w:t>
+      </w:r>
+    </w:p>
+    <w:p>
+      <w:r>
+        <w:t>from django.db import transaction</w:t>
+      </w:r>
+    </w:p>
+    <w:p>
+      <w:r>
+        <w:t>from django.contrib import messages</w:t>
+      </w:r>
+    </w:p>
+    <w:p>
+      <w:r>
+        <w:t>from .models import Enrollment</w:t>
+      </w:r>
+    </w:p>
+    <w:p>
+      <w:r>
+        <w:t>from courses.models import Course</w:t>
+      </w:r>
+    </w:p>
+    <w:p/>
+    <w:p>
+      <w:r>
+        <w:t>class EnrollmentCreateView(LoginRequiredMixin, CreateView):</w:t>
+      </w:r>
+    </w:p>
+    <w:p>
+      <w:r>
+        <w:t xml:space="preserve">    model = Enrollment</w:t>
+      </w:r>
+    </w:p>
+    <w:p>
+      <w:r>
+        <w:t xml:space="preserve">    template_name = 'enrollments/enrollment_form.html'</w:t>
+      </w:r>
+    </w:p>
+    <w:p>
+      <w:r>
+        <w:t xml:space="preserve">    fields = [] # No form fields needed; we extract data from the URL and logged-in user</w:t>
+      </w:r>
+    </w:p>
+    <w:p>
+      <w:r>
+        <w:t xml:space="preserve">    success_url = reverse_lazy('courses:list')</w:t>
+      </w:r>
+    </w:p>
+    <w:p/>
+    <w:p>
+      <w:r>
+        <w:t xml:space="preserve">    def get_context_data(self, **kwargs):</w:t>
+      </w:r>
+    </w:p>
+    <w:p>
+      <w:r>
+        <w:t xml:space="preserve">        # Pass the specific course to the template so we can display its title</w:t>
+      </w:r>
+    </w:p>
+    <w:p>
+      <w:r>
+        <w:t xml:space="preserve">        context = super().get_context_data(**kwargs)</w:t>
+      </w:r>
+    </w:p>
+    <w:p>
+      <w:r>
+        <w:t xml:space="preserve">        context['course'] = get_object_or_404(Course, id=self.kwargs['course_id'])</w:t>
+      </w:r>
+    </w:p>
+    <w:p>
+      <w:r>
+        <w:t xml:space="preserve">        return context</w:t>
+      </w:r>
+    </w:p>
+    <w:p/>
+    <w:p>
+      <w:r>
+        <w:t xml:space="preserve">    def form_valid(self, form):</w:t>
+      </w:r>
+    </w:p>
+    <w:p>
+      <w:r>
+        <w:t xml:space="preserve">        course = get_object_or_404(Course, id=self.kwargs['course_id'])</w:t>
+      </w:r>
+    </w:p>
+    <w:p>
+      <w:r>
+        <w:lastRenderedPageBreak/>
+        <w:t xml:space="preserve">        user = self.request.user</w:t>
+      </w:r>
+    </w:p>
+    <w:p/>
+    <w:p>
+      <w:r>
+        <w:t xml:space="preserve">        # Prevent duplicate enrollments</w:t>
+      </w:r>
+    </w:p>
+    <w:p>
+      <w:r>
+        <w:t xml:space="preserve">        if Enrollment.objects.filter(student=user, course=course).exists():</w:t>
+      </w:r>
+    </w:p>
+    <w:p>
+      <w:r>
+        <w:t xml:space="preserve">            messages.warning(self.request, f"You are already enrolled in {course.title}.")</w:t>
+      </w:r>
+    </w:p>
+    <w:p>
+      <w:r>
+        <w:t xml:space="preserve">            return redirect('courses:list')</w:t>
+      </w:r>
+    </w:p>
+    <w:p/>
+    <w:p>
+      <w:r>
+        <w:t xml:space="preserve">        # Atomic transaction for capacity management</w:t>
+      </w:r>
+    </w:p>
+    <w:p>
+      <w:r>
+        <w:t xml:space="preserve">        with transaction.atomic():</w:t>
+      </w:r>
+    </w:p>
+    <w:p>
+      <w:r>
+        <w:t xml:space="preserve">            locked_course = Course.objects.select_for_update().get(id=course.id)</w:t>
+      </w:r>
+    </w:p>
+    <w:p>
+      <w:r>
+        <w:t xml:space="preserve">            current_enrollments = Enrollment.objects.filter(course=locked_course, status='active').count()</w:t>
+      </w:r>
+    </w:p>
+    <w:p>
+      <w:r>
+        <w:t xml:space="preserve">            </w:t>
+      </w:r>
+    </w:p>
+    <w:p>
+      <w:r>
+        <w:t xml:space="preserve">            if current_enrollments &gt;= locked_course.capacity:</w:t>
+      </w:r>
+    </w:p>
+    <w:p>
+      <w:r>
+        <w:t xml:space="preserve">                messages.error(self.request, "Sorry, this course is currently at maximum capacity.")</w:t>
+      </w:r>
+    </w:p>
+    <w:p>
+      <w:r>
+        <w:t xml:space="preserve">                return redirect('courses:detail', pk=course.id)</w:t>
+      </w:r>
+    </w:p>
+    <w:p/>
+    <w:p>
+      <w:r>
+        <w:t xml:space="preserve">            # Save the enrollment</w:t>
+      </w:r>
+    </w:p>
+    <w:p>
+      <w:r>
+        <w:t xml:space="preserve">            form.instance.student = user</w:t>
+      </w:r>
+    </w:p>
+    <w:p>
+      <w:r>
+        <w:t xml:space="preserve">            form.instance.course = locked_course</w:t>
+      </w:r>
+    </w:p>
+    <w:p>
+      <w:r>
+        <w:t xml:space="preserve">            messages.success(self.request, f"Successfully enrolled in {locked_course.title}!")</w:t>
+      </w:r>
+    </w:p>
+    <w:p>
+      <w:r>
+        <w:t xml:space="preserve">            return super().form_valid(form)</w:t>
+      </w:r>
+    </w:p>
+    <w:p>
+      <w:r>
+        <w:rPr>
+          <w:b/>
+          <w:bCs/>
+        </w:rPr>
+        <w:t>3. enrollments/templates/enrollments/enrollment_form.html</w:t>
+      </w:r>
+      <w:r>
+        <w:t xml:space="preserve"> This is the final confirmation page before the database is altered.</w:t>
+      </w:r>
+    </w:p>
+    <w:p>
+      <w:r>
+        <w:t>HTML</w:t>
+      </w:r>
+    </w:p>
+    <w:p>
+      <w:r>
+        <w:t>{% extends 'base.html' %}</w:t>
+      </w:r>
+    </w:p>
+    <w:p/>
+    <w:p>
+      <w:r>
+        <w:lastRenderedPageBreak/>
+        <w:t>{% block content %}</w:t>
+      </w:r>
+    </w:p>
+    <w:p>
+      <w:r>
+        <w:t>&lt;div class="row justify-content-center mt-5"&gt;</w:t>
+      </w:r>
+    </w:p>
+    <w:p>
+      <w:r>
+        <w:t xml:space="preserve">    &lt;div class="col-md-6"&gt;</w:t>
+      </w:r>
+    </w:p>
+    <w:p>
+      <w:r>
+        <w:t xml:space="preserve">        &lt;div class="card shadow border-danger"&gt;</w:t>
+      </w:r>
+    </w:p>
+    <w:p>
+      <w:r>
+        <w:t xml:space="preserve">            &lt;div class="card-header bg-danger text-white"&gt;</w:t>
+      </w:r>
+    </w:p>
+    <w:p>
+      <w:r>
+        <w:t xml:space="preserve">                &lt;h4 class="mb-0"&gt;Confirm Enrollment&lt;/h4&gt;</w:t>
+      </w:r>
+    </w:p>
+    <w:p>
+      <w:r>
+        <w:t xml:space="preserve">            &lt;/div&gt;</w:t>
+      </w:r>
+    </w:p>
+    <w:p>
+      <w:r>
+        <w:t xml:space="preserve">            &lt;div class="card-body text-center"&gt;</w:t>
+      </w:r>
+    </w:p>
+    <w:p>
+      <w:r>
+        <w:t xml:space="preserve">                &lt;p class="lead"&gt;Are you sure you want to enroll in:&lt;/p&gt;</w:t>
+      </w:r>
+    </w:p>
+    <w:p>
+      <w:r>
+        <w:t xml:space="preserve">                &lt;h3 class="text-primary"&gt;{{ course.title }}&lt;/h3&gt;</w:t>
+      </w:r>
+    </w:p>
+    <w:p>
+      <w:r>
+        <w:t xml:space="preserve">                </w:t>
+      </w:r>
+    </w:p>
+    <w:p>
+      <w:r>
+        <w:t xml:space="preserve">                &lt;form method="POST" class="mt-4"&gt;</w:t>
+      </w:r>
+    </w:p>
+    <w:p>
+      <w:r>
+        <w:t xml:space="preserve">                    {% csrf_token %}</w:t>
+      </w:r>
+    </w:p>
+    <w:p>
+      <w:r>
+        <w:t xml:space="preserve">                    &lt;button type="submit" class="btn btn-success btn-lg px-5"&gt;Confirm&lt;/button&gt;</w:t>
+      </w:r>
+    </w:p>
+    <w:p>
+      <w:r>
+        <w:t xml:space="preserve">                    &lt;a href="{% url 'courses:detail' course.id %}" class="btn btn-outline-secondary btn-lg ms-2"&gt;Cancel&lt;/a&gt;</w:t>
+      </w:r>
+    </w:p>
+    <w:p>
+      <w:r>
+        <w:t xml:space="preserve">                &lt;/form&gt;</w:t>
+      </w:r>
+    </w:p>
+    <w:p>
+      <w:r>
+        <w:t xml:space="preserve">            &lt;/div&gt;</w:t>
+      </w:r>
+    </w:p>
+    <w:p>
+      <w:r>
+        <w:t xml:space="preserve">        &lt;/div&gt;</w:t>
+      </w:r>
+    </w:p>
+    <w:p>
+      <w:r>
+        <w:t xml:space="preserve">    &lt;/div&gt;</w:t>
+      </w:r>
+    </w:p>
+    <w:p>
+      <w:r>
+        <w:t>&lt;/div&gt;</w:t>
+      </w:r>
+    </w:p>
+    <w:p>
+      <w:r>
+        <w:t>{% endblock %}</w:t>
+      </w:r>
+    </w:p>
+    <w:p/>
     <w:p/>
     <w:sectPr>
       <w:pgSz w:w="12240" w:h="15840"/>

</xml_diff>